<commit_message>
op11: B + varia
</commit_message>
<xml_diff>
--- a/convert_source_description/QB_Op7_B_conv.docx
+++ b/convert_source_description/QB_Op7_B_conv.docx
@@ -100,25 +100,14 @@
           <w:lang w:val="de-DE"/>
         </w:rPr>
       </w:pPr>
-      <w:proofErr w:type="gramStart"/>
-      <w:r>
-        <w:rPr>
-          <w:rFonts w:ascii="Times New Roman" w:hAnsi="Times New Roman" w:cs="Times New Roman"/>
-          <w:sz w:val="20"/>
-          <w:szCs w:val="20"/>
-          <w:lang w:val="de-DE"/>
-        </w:rPr>
-        <w:t>Autographe</w:t>
-      </w:r>
-      <w:proofErr w:type="gramEnd"/>
-      <w:r>
-        <w:rPr>
-          <w:rFonts w:ascii="Times New Roman" w:hAnsi="Times New Roman" w:cs="Times New Roman"/>
-          <w:sz w:val="20"/>
-          <w:szCs w:val="20"/>
-          <w:lang w:val="de-DE"/>
-        </w:rPr>
-        <w:t xml:space="preserve"> </w:t>
+      <w:r>
+        <w:rPr>
+          <w:rFonts w:ascii="Times New Roman" w:hAnsi="Times New Roman" w:cs="Times New Roman"/>
+          <w:sz w:val="20"/>
+          <w:szCs w:val="20"/>
+          <w:lang w:val="de-DE"/>
+        </w:rPr>
+        <w:t xml:space="preserve">Autographe </w:t>
       </w:r>
       <w:r>
         <w:rPr>
@@ -192,7 +181,16 @@
           <w:szCs w:val="20"/>
           <w:lang w:val="de-DE"/>
         </w:rPr>
-        <w:t>54</w:t>
+        <w:t>6</w:t>
+      </w:r>
+      <w:r>
+        <w:rPr>
+          <w:rFonts w:ascii="Times New Roman" w:hAnsi="Times New Roman" w:cs="Times New Roman"/>
+          <w:sz w:val="20"/>
+          <w:szCs w:val="20"/>
+          <w:lang w:val="de-DE"/>
+        </w:rPr>
+        <w:t>4</w:t>
       </w:r>
       <w:r>
         <w:rPr>
@@ -294,27 +292,7 @@
           <w:szCs w:val="20"/>
           <w:lang w:val="de-DE"/>
         </w:rPr>
-        <w:t xml:space="preserve"> Blätter (</w:t>
-      </w:r>
-      <w:proofErr w:type="spellStart"/>
-      <w:r>
-        <w:rPr>
-          <w:rFonts w:ascii="Times New Roman" w:hAnsi="Times New Roman" w:cs="Times New Roman"/>
-          <w:sz w:val="20"/>
-          <w:szCs w:val="20"/>
-          <w:lang w:val="de-DE"/>
-        </w:rPr>
-        <w:t>Bl</w:t>
-      </w:r>
-      <w:proofErr w:type="spellEnd"/>
-      <w:r>
-        <w:rPr>
-          <w:rFonts w:ascii="Times New Roman" w:hAnsi="Times New Roman" w:cs="Times New Roman"/>
-          <w:sz w:val="20"/>
-          <w:szCs w:val="20"/>
-          <w:lang w:val="de-DE"/>
-        </w:rPr>
-        <w:t>. 1–</w:t>
+        <w:t xml:space="preserve"> Blätter (Bl. 1–</w:t>
       </w:r>
       <w:r>
         <w:rPr>
@@ -341,47 +319,7 @@
           <w:szCs w:val="20"/>
           <w:lang w:val="de-DE"/>
         </w:rPr>
-        <w:t xml:space="preserve"> 1 Blatt (</w:t>
-      </w:r>
-      <w:proofErr w:type="spellStart"/>
-      <w:r>
-        <w:rPr>
-          <w:rFonts w:ascii="Times New Roman" w:hAnsi="Times New Roman" w:cs="Times New Roman"/>
-          <w:sz w:val="20"/>
-          <w:szCs w:val="20"/>
-          <w:lang w:val="de-DE"/>
-        </w:rPr>
-        <w:t>Bl</w:t>
-      </w:r>
-      <w:proofErr w:type="spellEnd"/>
-      <w:r>
-        <w:rPr>
-          <w:rFonts w:ascii="Times New Roman" w:hAnsi="Times New Roman" w:cs="Times New Roman"/>
-          <w:sz w:val="20"/>
-          <w:szCs w:val="20"/>
-          <w:lang w:val="de-DE"/>
-        </w:rPr>
-        <w:t>. 1), 2 ineinander gelegte Bögen (</w:t>
-      </w:r>
-      <w:proofErr w:type="spellStart"/>
-      <w:r>
-        <w:rPr>
-          <w:rFonts w:ascii="Times New Roman" w:hAnsi="Times New Roman" w:cs="Times New Roman"/>
-          <w:sz w:val="20"/>
-          <w:szCs w:val="20"/>
-          <w:lang w:val="de-DE"/>
-        </w:rPr>
-        <w:t>Bl</w:t>
-      </w:r>
-      <w:proofErr w:type="spellEnd"/>
-      <w:r>
-        <w:rPr>
-          <w:rFonts w:ascii="Times New Roman" w:hAnsi="Times New Roman" w:cs="Times New Roman"/>
-          <w:sz w:val="20"/>
-          <w:szCs w:val="20"/>
-          <w:lang w:val="de-DE"/>
-        </w:rPr>
-        <w:t>. 2/5, 3/4</w:t>
+        <w:t xml:space="preserve"> 1 Blatt (Bl. 1), 2 ineinander gelegte Bögen (Bl. 2/5, 3/4</w:t>
       </w:r>
       <w:r>
         <w:rPr>
@@ -399,27 +337,7 @@
           <w:szCs w:val="20"/>
           <w:lang w:val="de-DE"/>
         </w:rPr>
-        <w:t>1 Bogen (</w:t>
-      </w:r>
-      <w:proofErr w:type="spellStart"/>
-      <w:r>
-        <w:rPr>
-          <w:rFonts w:ascii="Times New Roman" w:hAnsi="Times New Roman" w:cs="Times New Roman"/>
-          <w:sz w:val="20"/>
-          <w:szCs w:val="20"/>
-          <w:lang w:val="de-DE"/>
-        </w:rPr>
-        <w:t>Bl</w:t>
-      </w:r>
-      <w:proofErr w:type="spellEnd"/>
-      <w:r>
-        <w:rPr>
-          <w:rFonts w:ascii="Times New Roman" w:hAnsi="Times New Roman" w:cs="Times New Roman"/>
-          <w:sz w:val="20"/>
-          <w:szCs w:val="20"/>
-          <w:lang w:val="de-DE"/>
-        </w:rPr>
-        <w:t xml:space="preserve">. </w:t>
+        <w:t xml:space="preserve">1 Bogen (Bl. </w:t>
       </w:r>
       <w:r>
         <w:rPr>
@@ -473,27 +391,7 @@
           <w:szCs w:val="20"/>
           <w:lang w:val="de-DE"/>
         </w:rPr>
-        <w:t xml:space="preserve"> 1 Blatt (</w:t>
-      </w:r>
-      <w:proofErr w:type="spellStart"/>
-      <w:r>
-        <w:rPr>
-          <w:rFonts w:ascii="Times New Roman" w:hAnsi="Times New Roman" w:cs="Times New Roman"/>
-          <w:sz w:val="20"/>
-          <w:szCs w:val="20"/>
-          <w:lang w:val="de-DE"/>
-        </w:rPr>
-        <w:t>Bl</w:t>
-      </w:r>
-      <w:proofErr w:type="spellEnd"/>
-      <w:r>
-        <w:rPr>
-          <w:rFonts w:ascii="Times New Roman" w:hAnsi="Times New Roman" w:cs="Times New Roman"/>
-          <w:sz w:val="20"/>
-          <w:szCs w:val="20"/>
-          <w:lang w:val="de-DE"/>
-        </w:rPr>
-        <w:t xml:space="preserve">. </w:t>
+        <w:t xml:space="preserve"> 1 Blatt (Bl. </w:t>
       </w:r>
       <w:r>
         <w:rPr>
@@ -578,47 +476,7 @@
           <w:szCs w:val="20"/>
           <w:lang w:val="de-DE"/>
         </w:rPr>
-        <w:t xml:space="preserve"> unten links (</w:t>
-      </w:r>
-      <w:proofErr w:type="spellStart"/>
-      <w:r>
-        <w:rPr>
-          <w:rFonts w:ascii="Times New Roman" w:hAnsi="Times New Roman" w:cs="Times New Roman"/>
-          <w:sz w:val="20"/>
-          <w:szCs w:val="20"/>
-          <w:lang w:val="de-DE"/>
-        </w:rPr>
-        <w:t>recto</w:t>
-      </w:r>
-      <w:proofErr w:type="spellEnd"/>
-      <w:r>
-        <w:rPr>
-          <w:rFonts w:ascii="Times New Roman" w:hAnsi="Times New Roman" w:cs="Times New Roman"/>
-          <w:sz w:val="20"/>
-          <w:szCs w:val="20"/>
-          <w:lang w:val="de-DE"/>
-        </w:rPr>
-        <w:t>) oder rechts (</w:t>
-      </w:r>
-      <w:proofErr w:type="spellStart"/>
-      <w:r>
-        <w:rPr>
-          <w:rFonts w:ascii="Times New Roman" w:hAnsi="Times New Roman" w:cs="Times New Roman"/>
-          <w:sz w:val="20"/>
-          <w:szCs w:val="20"/>
-          <w:lang w:val="de-DE"/>
-        </w:rPr>
-        <w:t>verso</w:t>
-      </w:r>
-      <w:proofErr w:type="spellEnd"/>
-      <w:r>
-        <w:rPr>
-          <w:rFonts w:ascii="Times New Roman" w:hAnsi="Times New Roman" w:cs="Times New Roman"/>
-          <w:sz w:val="20"/>
-          <w:szCs w:val="20"/>
-          <w:lang w:val="de-DE"/>
-        </w:rPr>
-        <w:t>)</w:t>
+        <w:t xml:space="preserve"> unten links (recto) oder rechts (verso)</w:t>
       </w:r>
       <w:r>
         <w:rPr>
@@ -647,27 +505,7 @@
           <w:szCs w:val="20"/>
           <w:lang w:val="de-DE"/>
         </w:rPr>
-        <w:t xml:space="preserve"> auf </w:t>
-      </w:r>
-      <w:proofErr w:type="spellStart"/>
-      <w:r>
-        <w:rPr>
-          <w:rFonts w:ascii="Times New Roman" w:hAnsi="Times New Roman" w:cs="Times New Roman"/>
-          <w:sz w:val="20"/>
-          <w:szCs w:val="20"/>
-          <w:lang w:val="de-DE"/>
-        </w:rPr>
-        <w:t>Bl</w:t>
-      </w:r>
-      <w:proofErr w:type="spellEnd"/>
-      <w:r>
-        <w:rPr>
-          <w:rFonts w:ascii="Times New Roman" w:hAnsi="Times New Roman" w:cs="Times New Roman"/>
-          <w:sz w:val="20"/>
-          <w:szCs w:val="20"/>
-          <w:lang w:val="de-DE"/>
-        </w:rPr>
-        <w:t>. 4</w:t>
+        <w:t xml:space="preserve"> auf Bl. 4</w:t>
       </w:r>
       <w:r>
         <w:rPr>
@@ -695,27 +533,7 @@
           <w:szCs w:val="20"/>
           <w:lang w:val="de-DE"/>
         </w:rPr>
-        <w:t xml:space="preserve">. </w:t>
-      </w:r>
-      <w:proofErr w:type="spellStart"/>
-      <w:r>
-        <w:rPr>
-          <w:rFonts w:ascii="Times New Roman" w:hAnsi="Times New Roman" w:cs="Times New Roman"/>
-          <w:sz w:val="20"/>
-          <w:szCs w:val="20"/>
-          <w:lang w:val="de-DE"/>
-        </w:rPr>
-        <w:t>Bl</w:t>
-      </w:r>
-      <w:proofErr w:type="spellEnd"/>
-      <w:r>
-        <w:rPr>
-          <w:rFonts w:ascii="Times New Roman" w:hAnsi="Times New Roman" w:cs="Times New Roman"/>
-          <w:sz w:val="20"/>
-          <w:szCs w:val="20"/>
-          <w:lang w:val="de-DE"/>
-        </w:rPr>
-        <w:t>. 1</w:t>
+        <w:t>. Bl. 1</w:t>
       </w:r>
       <w:r>
         <w:rPr>
@@ -837,47 +655,7 @@
           <w:szCs w:val="20"/>
           <w:lang w:val="de-DE"/>
         </w:rPr>
-        <w:t>, bis auf die archivalische Paginierung unbeschriftet. Rissspuren am linken (</w:t>
-      </w:r>
-      <w:proofErr w:type="spellStart"/>
-      <w:r>
-        <w:rPr>
-          <w:rFonts w:ascii="Times New Roman" w:hAnsi="Times New Roman" w:cs="Times New Roman"/>
-          <w:sz w:val="20"/>
-          <w:szCs w:val="20"/>
-          <w:lang w:val="de-DE"/>
-        </w:rPr>
-        <w:t>recto</w:t>
-      </w:r>
-      <w:proofErr w:type="spellEnd"/>
-      <w:r>
-        <w:rPr>
-          <w:rFonts w:ascii="Times New Roman" w:hAnsi="Times New Roman" w:cs="Times New Roman"/>
-          <w:sz w:val="20"/>
-          <w:szCs w:val="20"/>
-          <w:lang w:val="de-DE"/>
-        </w:rPr>
-        <w:t xml:space="preserve">) Rand von </w:t>
-      </w:r>
-      <w:proofErr w:type="spellStart"/>
-      <w:r>
-        <w:rPr>
-          <w:rFonts w:ascii="Times New Roman" w:hAnsi="Times New Roman" w:cs="Times New Roman"/>
-          <w:sz w:val="20"/>
-          <w:szCs w:val="20"/>
-          <w:lang w:val="de-DE"/>
-        </w:rPr>
-        <w:t>Bl</w:t>
-      </w:r>
-      <w:proofErr w:type="spellEnd"/>
-      <w:r>
-        <w:rPr>
-          <w:rFonts w:ascii="Times New Roman" w:hAnsi="Times New Roman" w:cs="Times New Roman"/>
-          <w:sz w:val="20"/>
-          <w:szCs w:val="20"/>
-          <w:lang w:val="de-DE"/>
-        </w:rPr>
-        <w:t>. 1</w:t>
+        <w:t>, bis auf die archivalische Paginierung unbeschriftet. Rissspuren am linken (recto) Rand von Bl. 1</w:t>
       </w:r>
       <w:r>
         <w:rPr>
@@ -1009,7 +787,6 @@
         </w:rPr>
         <w:t xml:space="preserve"> mm, Firmenzeichen: [JE] | </w:t>
       </w:r>
-      <w:proofErr w:type="spellStart"/>
       <w:r>
         <w:rPr>
           <w:rFonts w:ascii="Times New Roman" w:hAnsi="Times New Roman" w:cs="Times New Roman"/>
@@ -1018,9 +795,8 @@
           <w:szCs w:val="20"/>
           <w:lang w:val="de-DE"/>
         </w:rPr>
-        <w:t>No</w:t>
-      </w:r>
-      <w:proofErr w:type="spellEnd"/>
+        <w:t xml:space="preserve">No. </w:t>
+      </w:r>
       <w:r>
         <w:rPr>
           <w:rFonts w:ascii="Times New Roman" w:hAnsi="Times New Roman" w:cs="Times New Roman"/>
@@ -1029,7 +805,7 @@
           <w:szCs w:val="20"/>
           <w:lang w:val="de-DE"/>
         </w:rPr>
-        <w:t xml:space="preserve">. </w:t>
+        <w:t>8</w:t>
       </w:r>
       <w:r>
         <w:rPr>
@@ -1039,7 +815,7 @@
           <w:szCs w:val="20"/>
           <w:lang w:val="de-DE"/>
         </w:rPr>
-        <w:t>8</w:t>
+        <w:t xml:space="preserve"> | 2</w:t>
       </w:r>
       <w:r>
         <w:rPr>
@@ -1049,7 +825,7 @@
           <w:szCs w:val="20"/>
           <w:lang w:val="de-DE"/>
         </w:rPr>
-        <w:t xml:space="preserve"> | 2</w:t>
+        <w:t>4</w:t>
       </w:r>
       <w:r>
         <w:rPr>
@@ -1059,88 +835,16 @@
           <w:szCs w:val="20"/>
           <w:lang w:val="de-DE"/>
         </w:rPr>
-        <w:t>4</w:t>
-      </w:r>
-      <w:r>
-        <w:rPr>
-          <w:rFonts w:ascii="Times New Roman" w:hAnsi="Times New Roman" w:cs="Times New Roman"/>
-          <w:i/>
-          <w:sz w:val="20"/>
-          <w:szCs w:val="20"/>
-          <w:lang w:val="de-DE"/>
-        </w:rPr>
-        <w:t xml:space="preserve"> </w:t>
-      </w:r>
-      <w:proofErr w:type="spellStart"/>
-      <w:r>
-        <w:rPr>
-          <w:rFonts w:ascii="Times New Roman" w:hAnsi="Times New Roman" w:cs="Times New Roman"/>
-          <w:i/>
-          <w:sz w:val="20"/>
-          <w:szCs w:val="20"/>
-          <w:lang w:val="de-DE"/>
-        </w:rPr>
-        <w:t>linig</w:t>
-      </w:r>
-      <w:proofErr w:type="spellEnd"/>
-      <w:r>
-        <w:rPr>
-          <w:rFonts w:ascii="Times New Roman" w:hAnsi="Times New Roman" w:cs="Times New Roman"/>
-          <w:i/>
-          <w:sz w:val="20"/>
-          <w:szCs w:val="20"/>
-          <w:lang w:val="de-DE"/>
-        </w:rPr>
-        <w:t>.</w:t>
-      </w:r>
-      <w:r>
-        <w:rPr>
-          <w:rFonts w:ascii="Times New Roman" w:hAnsi="Times New Roman" w:cs="Times New Roman"/>
-          <w:sz w:val="20"/>
-          <w:szCs w:val="20"/>
-          <w:lang w:val="de-DE"/>
-        </w:rPr>
-        <w:t xml:space="preserve"> </w:t>
-      </w:r>
-      <w:proofErr w:type="spellStart"/>
-      <w:r>
-        <w:rPr>
-          <w:rFonts w:ascii="Times New Roman" w:hAnsi="Times New Roman" w:cs="Times New Roman"/>
-          <w:sz w:val="20"/>
-          <w:szCs w:val="20"/>
-          <w:lang w:val="de-DE"/>
-        </w:rPr>
-        <w:t>recto</w:t>
-      </w:r>
-      <w:proofErr w:type="spellEnd"/>
-      <w:r>
-        <w:rPr>
-          <w:rFonts w:ascii="Times New Roman" w:hAnsi="Times New Roman" w:cs="Times New Roman"/>
-          <w:sz w:val="20"/>
-          <w:szCs w:val="20"/>
-          <w:lang w:val="de-DE"/>
-        </w:rPr>
-        <w:t xml:space="preserve"> unten links (</w:t>
-      </w:r>
-      <w:proofErr w:type="spellStart"/>
-      <w:r>
-        <w:rPr>
-          <w:rFonts w:ascii="Times New Roman" w:hAnsi="Times New Roman" w:cs="Times New Roman"/>
-          <w:sz w:val="20"/>
-          <w:szCs w:val="20"/>
-          <w:lang w:val="de-DE"/>
-        </w:rPr>
-        <w:t>Bl</w:t>
-      </w:r>
-      <w:proofErr w:type="spellEnd"/>
-      <w:r>
-        <w:rPr>
-          <w:rFonts w:ascii="Times New Roman" w:hAnsi="Times New Roman" w:cs="Times New Roman"/>
-          <w:sz w:val="20"/>
-          <w:szCs w:val="20"/>
-          <w:lang w:val="de-DE"/>
-        </w:rPr>
-        <w:t>. 1</w:t>
+        <w:t xml:space="preserve"> linig.</w:t>
+      </w:r>
+      <w:r>
+        <w:rPr>
+          <w:rFonts w:ascii="Times New Roman" w:hAnsi="Times New Roman" w:cs="Times New Roman"/>
+          <w:sz w:val="20"/>
+          <w:szCs w:val="20"/>
+          <w:lang w:val="de-DE"/>
+        </w:rPr>
+        <w:t xml:space="preserve"> recto unten links (Bl. 1</w:t>
       </w:r>
       <w:r>
         <w:rPr>
@@ -1226,7 +930,6 @@
         </w:rPr>
         <w:t xml:space="preserve"> × 265 mm, Firmenzeichen: [JE] | </w:t>
       </w:r>
-      <w:proofErr w:type="spellStart"/>
       <w:r>
         <w:rPr>
           <w:rFonts w:ascii="Times New Roman" w:hAnsi="Times New Roman" w:cs="Times New Roman"/>
@@ -1235,9 +938,8 @@
           <w:szCs w:val="20"/>
           <w:lang w:val="de-DE"/>
         </w:rPr>
-        <w:t>No</w:t>
-      </w:r>
-      <w:proofErr w:type="spellEnd"/>
+        <w:t xml:space="preserve">No. </w:t>
+      </w:r>
       <w:r>
         <w:rPr>
           <w:rFonts w:ascii="Times New Roman" w:hAnsi="Times New Roman" w:cs="Times New Roman"/>
@@ -1246,7 +948,7 @@
           <w:szCs w:val="20"/>
           <w:lang w:val="de-DE"/>
         </w:rPr>
-        <w:t xml:space="preserve">. </w:t>
+        <w:t>1</w:t>
       </w:r>
       <w:r>
         <w:rPr>
@@ -1256,7 +958,7 @@
           <w:szCs w:val="20"/>
           <w:lang w:val="de-DE"/>
         </w:rPr>
-        <w:t>1</w:t>
+        <w:t xml:space="preserve"> | </w:t>
       </w:r>
       <w:r>
         <w:rPr>
@@ -1266,7 +968,7 @@
           <w:szCs w:val="20"/>
           <w:lang w:val="de-DE"/>
         </w:rPr>
-        <w:t xml:space="preserve"> | </w:t>
+        <w:t>10</w:t>
       </w:r>
       <w:r>
         <w:rPr>
@@ -1276,88 +978,16 @@
           <w:szCs w:val="20"/>
           <w:lang w:val="de-DE"/>
         </w:rPr>
-        <w:t>10</w:t>
-      </w:r>
-      <w:r>
-        <w:rPr>
-          <w:rFonts w:ascii="Times New Roman" w:hAnsi="Times New Roman" w:cs="Times New Roman"/>
-          <w:i/>
-          <w:sz w:val="20"/>
-          <w:szCs w:val="20"/>
-          <w:lang w:val="de-DE"/>
-        </w:rPr>
-        <w:t xml:space="preserve"> </w:t>
-      </w:r>
-      <w:proofErr w:type="spellStart"/>
-      <w:r>
-        <w:rPr>
-          <w:rFonts w:ascii="Times New Roman" w:hAnsi="Times New Roman" w:cs="Times New Roman"/>
-          <w:i/>
-          <w:sz w:val="20"/>
-          <w:szCs w:val="20"/>
-          <w:lang w:val="de-DE"/>
-        </w:rPr>
-        <w:t>linig</w:t>
-      </w:r>
-      <w:proofErr w:type="spellEnd"/>
-      <w:r>
-        <w:rPr>
-          <w:rFonts w:ascii="Times New Roman" w:hAnsi="Times New Roman" w:cs="Times New Roman"/>
-          <w:i/>
-          <w:sz w:val="20"/>
-          <w:szCs w:val="20"/>
-          <w:lang w:val="de-DE"/>
-        </w:rPr>
-        <w:t>.</w:t>
-      </w:r>
-      <w:r>
-        <w:rPr>
-          <w:rFonts w:ascii="Times New Roman" w:hAnsi="Times New Roman" w:cs="Times New Roman"/>
-          <w:sz w:val="20"/>
-          <w:szCs w:val="20"/>
-          <w:lang w:val="de-DE"/>
-        </w:rPr>
-        <w:t xml:space="preserve"> </w:t>
-      </w:r>
-      <w:proofErr w:type="spellStart"/>
-      <w:r>
-        <w:rPr>
-          <w:rFonts w:ascii="Times New Roman" w:hAnsi="Times New Roman" w:cs="Times New Roman"/>
-          <w:sz w:val="20"/>
-          <w:szCs w:val="20"/>
-          <w:lang w:val="de-DE"/>
-        </w:rPr>
-        <w:t>recto</w:t>
-      </w:r>
-      <w:proofErr w:type="spellEnd"/>
-      <w:r>
-        <w:rPr>
-          <w:rFonts w:ascii="Times New Roman" w:hAnsi="Times New Roman" w:cs="Times New Roman"/>
-          <w:sz w:val="20"/>
-          <w:szCs w:val="20"/>
-          <w:lang w:val="de-DE"/>
-        </w:rPr>
-        <w:t xml:space="preserve"> unten links (</w:t>
-      </w:r>
-      <w:proofErr w:type="spellStart"/>
-      <w:r>
-        <w:rPr>
-          <w:rFonts w:ascii="Times New Roman" w:hAnsi="Times New Roman" w:cs="Times New Roman"/>
-          <w:sz w:val="20"/>
-          <w:szCs w:val="20"/>
-          <w:lang w:val="de-DE"/>
-        </w:rPr>
-        <w:t>Bl</w:t>
-      </w:r>
-      <w:proofErr w:type="spellEnd"/>
-      <w:r>
-        <w:rPr>
-          <w:rFonts w:ascii="Times New Roman" w:hAnsi="Times New Roman" w:cs="Times New Roman"/>
-          <w:sz w:val="20"/>
-          <w:szCs w:val="20"/>
-          <w:lang w:val="de-DE"/>
-        </w:rPr>
-        <w:t xml:space="preserve">. </w:t>
+        <w:t xml:space="preserve"> linig.</w:t>
+      </w:r>
+      <w:r>
+        <w:rPr>
+          <w:rFonts w:ascii="Times New Roman" w:hAnsi="Times New Roman" w:cs="Times New Roman"/>
+          <w:sz w:val="20"/>
+          <w:szCs w:val="20"/>
+          <w:lang w:val="de-DE"/>
+        </w:rPr>
+        <w:t xml:space="preserve"> recto unten links (Bl. </w:t>
       </w:r>
       <w:r>
         <w:rPr>
@@ -1604,18 +1234,7 @@
           <w:szCs w:val="20"/>
           <w:lang w:val="de-DE"/>
         </w:rPr>
-        <w:t xml:space="preserve"> </w:t>
-      </w:r>
-      <w:proofErr w:type="spellStart"/>
-      <w:r>
-        <w:rPr>
-          <w:rFonts w:ascii="Times New Roman" w:hAnsi="Times New Roman" w:cs="Times New Roman"/>
-          <w:i/>
-          <w:sz w:val="20"/>
-          <w:szCs w:val="20"/>
-          <w:lang w:val="de-DE"/>
-        </w:rPr>
-        <w:t>N</w:t>
+        <w:t xml:space="preserve"> N</w:t>
       </w:r>
       <w:r>
         <w:rPr>
@@ -1629,7 +1248,6 @@
         </w:rPr>
         <w:t>o</w:t>
       </w:r>
-      <w:proofErr w:type="spellEnd"/>
       <w:r>
         <w:rPr>
           <w:rFonts w:ascii="Times New Roman" w:hAnsi="Times New Roman" w:cs="Times New Roman"/>
@@ -1690,7 +1308,6 @@
         </w:rPr>
         <w:t>&lt;</w:t>
       </w:r>
-      <w:proofErr w:type="spellStart"/>
       <w:r>
         <w:rPr>
           <w:rFonts w:ascii="Times New Roman" w:hAnsi="Times New Roman" w:cs="Times New Roman"/>
@@ -1699,18 +1316,7 @@
           <w:szCs w:val="20"/>
           <w:lang w:val="de-DE"/>
         </w:rPr>
-        <w:t>op</w:t>
-      </w:r>
-      <w:proofErr w:type="spellEnd"/>
-      <w:r>
-        <w:rPr>
-          <w:rFonts w:ascii="Times New Roman" w:hAnsi="Times New Roman" w:cs="Times New Roman"/>
-          <w:i/>
-          <w:sz w:val="20"/>
-          <w:szCs w:val="20"/>
-          <w:lang w:val="de-DE"/>
-        </w:rPr>
-        <w:t xml:space="preserve">[.] </w:t>
+        <w:t xml:space="preserve">op[.] </w:t>
       </w:r>
       <w:r>
         <w:rPr>
@@ -1835,7 +1441,6 @@
         </w:rPr>
         <w:t xml:space="preserve"> | &lt;</w:t>
       </w:r>
-      <w:proofErr w:type="spellStart"/>
       <w:r>
         <w:rPr>
           <w:rFonts w:ascii="Times New Roman" w:hAnsi="Times New Roman" w:cs="Times New Roman"/>
@@ -1845,21 +1450,8 @@
           <w:u w:val="single"/>
           <w:lang w:val="de-DE"/>
         </w:rPr>
-        <w:t>endgiltige</w:t>
-      </w:r>
-      <w:proofErr w:type="spellEnd"/>
-      <w:r>
-        <w:rPr>
-          <w:rFonts w:ascii="Times New Roman" w:hAnsi="Times New Roman" w:cs="Times New Roman"/>
-          <w:i/>
-          <w:sz w:val="20"/>
-          <w:szCs w:val="20"/>
-          <w:u w:val="single"/>
-          <w:lang w:val="de-DE"/>
-        </w:rPr>
-        <w:t xml:space="preserve"> Fassung So</w:t>
-      </w:r>
-      <w:proofErr w:type="spellStart"/>
+        <w:t>endgiltige Fassung So</w:t>
+      </w:r>
       <w:r>
         <w:rPr>
           <w:rFonts w:ascii="Times New Roman" w:hAnsi="Times New Roman" w:cs="Times New Roman"/>
@@ -1882,7 +1474,6 @@
         </w:rPr>
         <w:t>e</w:t>
       </w:r>
-      <w:proofErr w:type="spellEnd"/>
       <w:r>
         <w:rPr>
           <w:rFonts w:ascii="Times New Roman" w:hAnsi="Times New Roman" w:cs="Times New Roman"/>
@@ -1929,27 +1520,7 @@
           <w:szCs w:val="20"/>
           <w:lang w:val="de-DE"/>
         </w:rPr>
-        <w:t xml:space="preserve">auf </w:t>
-      </w:r>
-      <w:proofErr w:type="spellStart"/>
-      <w:r>
-        <w:rPr>
-          <w:rFonts w:ascii="Times New Roman" w:hAnsi="Times New Roman" w:cs="Times New Roman"/>
-          <w:sz w:val="20"/>
-          <w:szCs w:val="20"/>
-          <w:lang w:val="de-DE"/>
-        </w:rPr>
-        <w:t>Bl</w:t>
-      </w:r>
-      <w:proofErr w:type="spellEnd"/>
-      <w:r>
-        <w:rPr>
-          <w:rFonts w:ascii="Times New Roman" w:hAnsi="Times New Roman" w:cs="Times New Roman"/>
-          <w:sz w:val="20"/>
-          <w:szCs w:val="20"/>
-          <w:lang w:val="de-DE"/>
-        </w:rPr>
-        <w:t>. 1</w:t>
+        <w:t>auf Bl. 1</w:t>
       </w:r>
       <w:r>
         <w:rPr>
@@ -2063,27 +1634,7 @@
           <w:szCs w:val="20"/>
           <w:lang w:val="de-DE"/>
         </w:rPr>
-        <w:t xml:space="preserve"> auf </w:t>
-      </w:r>
-      <w:proofErr w:type="spellStart"/>
-      <w:r>
-        <w:rPr>
-          <w:rFonts w:ascii="Times New Roman" w:hAnsi="Times New Roman" w:cs="Times New Roman"/>
-          <w:sz w:val="20"/>
-          <w:szCs w:val="20"/>
-          <w:lang w:val="de-DE"/>
-        </w:rPr>
-        <w:t>Bl</w:t>
-      </w:r>
-      <w:proofErr w:type="spellEnd"/>
-      <w:r>
-        <w:rPr>
-          <w:rFonts w:ascii="Times New Roman" w:hAnsi="Times New Roman" w:cs="Times New Roman"/>
-          <w:sz w:val="20"/>
-          <w:szCs w:val="20"/>
-          <w:lang w:val="de-DE"/>
-        </w:rPr>
-        <w:t xml:space="preserve">. </w:t>
+        <w:t xml:space="preserve"> auf Bl. </w:t>
       </w:r>
       <w:r>
         <w:rPr>
@@ -2183,27 +1734,7 @@
           <w:szCs w:val="20"/>
           <w:lang w:val="de-DE"/>
         </w:rPr>
-        <w:t xml:space="preserve"> auf </w:t>
-      </w:r>
-      <w:proofErr w:type="spellStart"/>
-      <w:r>
-        <w:rPr>
-          <w:rFonts w:ascii="Times New Roman" w:hAnsi="Times New Roman" w:cs="Times New Roman"/>
-          <w:sz w:val="20"/>
-          <w:szCs w:val="20"/>
-          <w:lang w:val="de-DE"/>
-        </w:rPr>
-        <w:t>Bl</w:t>
-      </w:r>
-      <w:proofErr w:type="spellEnd"/>
-      <w:r>
-        <w:rPr>
-          <w:rFonts w:ascii="Times New Roman" w:hAnsi="Times New Roman" w:cs="Times New Roman"/>
-          <w:sz w:val="20"/>
-          <w:szCs w:val="20"/>
-          <w:lang w:val="de-DE"/>
-        </w:rPr>
-        <w:t xml:space="preserve">. </w:t>
+        <w:t xml:space="preserve"> auf Bl. </w:t>
       </w:r>
       <w:r>
         <w:rPr>
@@ -2285,27 +1816,7 @@
           <w:szCs w:val="20"/>
           <w:lang w:val="de-DE"/>
         </w:rPr>
-        <w:t xml:space="preserve"> auf </w:t>
-      </w:r>
-      <w:proofErr w:type="spellStart"/>
-      <w:r>
-        <w:rPr>
-          <w:rFonts w:ascii="Times New Roman" w:hAnsi="Times New Roman" w:cs="Times New Roman"/>
-          <w:sz w:val="20"/>
-          <w:szCs w:val="20"/>
-          <w:lang w:val="de-DE"/>
-        </w:rPr>
-        <w:t>Bl</w:t>
-      </w:r>
-      <w:proofErr w:type="spellEnd"/>
-      <w:r>
-        <w:rPr>
-          <w:rFonts w:ascii="Times New Roman" w:hAnsi="Times New Roman" w:cs="Times New Roman"/>
-          <w:sz w:val="20"/>
-          <w:szCs w:val="20"/>
-          <w:lang w:val="de-DE"/>
-        </w:rPr>
-        <w:t xml:space="preserve">. </w:t>
+        <w:t xml:space="preserve"> auf Bl. </w:t>
       </w:r>
       <w:r>
         <w:rPr>
@@ -2387,27 +1898,7 @@
           <w:szCs w:val="20"/>
           <w:lang w:val="de-DE"/>
         </w:rPr>
-        <w:t xml:space="preserve"> auf </w:t>
-      </w:r>
-      <w:proofErr w:type="spellStart"/>
-      <w:r>
-        <w:rPr>
-          <w:rFonts w:ascii="Times New Roman" w:hAnsi="Times New Roman" w:cs="Times New Roman"/>
-          <w:sz w:val="20"/>
-          <w:szCs w:val="20"/>
-          <w:lang w:val="de-DE"/>
-        </w:rPr>
-        <w:t>Bl</w:t>
-      </w:r>
-      <w:proofErr w:type="spellEnd"/>
-      <w:r>
-        <w:rPr>
-          <w:rFonts w:ascii="Times New Roman" w:hAnsi="Times New Roman" w:cs="Times New Roman"/>
-          <w:sz w:val="20"/>
-          <w:szCs w:val="20"/>
-          <w:lang w:val="de-DE"/>
-        </w:rPr>
-        <w:t xml:space="preserve">. </w:t>
+        <w:t xml:space="preserve"> auf Bl. </w:t>
       </w:r>
       <w:r>
         <w:rPr>
@@ -2625,27 +2116,7 @@
           <w:szCs w:val="20"/>
           <w:lang w:val="de-DE"/>
         </w:rPr>
-        <w:t xml:space="preserve">auf </w:t>
-      </w:r>
-      <w:proofErr w:type="spellStart"/>
-      <w:r>
-        <w:rPr>
-          <w:rFonts w:ascii="Times New Roman" w:hAnsi="Times New Roman" w:cs="Times New Roman"/>
-          <w:sz w:val="20"/>
-          <w:szCs w:val="20"/>
-          <w:lang w:val="de-DE"/>
-        </w:rPr>
-        <w:t>Bl</w:t>
-      </w:r>
-      <w:proofErr w:type="spellEnd"/>
-      <w:r>
-        <w:rPr>
-          <w:rFonts w:ascii="Times New Roman" w:hAnsi="Times New Roman" w:cs="Times New Roman"/>
-          <w:sz w:val="20"/>
-          <w:szCs w:val="20"/>
-          <w:lang w:val="de-DE"/>
-        </w:rPr>
-        <w:t xml:space="preserve">. </w:t>
+        <w:t xml:space="preserve">auf Bl. </w:t>
       </w:r>
       <w:r>
         <w:rPr>
@@ -2710,27 +2181,7 @@
           <w:szCs w:val="20"/>
           <w:lang w:val="de-DE"/>
         </w:rPr>
-        <w:t xml:space="preserve">und </w:t>
-      </w:r>
-      <w:proofErr w:type="spellStart"/>
-      <w:r>
-        <w:rPr>
-          <w:rFonts w:ascii="Times New Roman" w:hAnsi="Times New Roman" w:cs="Times New Roman"/>
-          <w:sz w:val="20"/>
-          <w:szCs w:val="20"/>
-          <w:lang w:val="de-DE"/>
-        </w:rPr>
-        <w:t>Bl</w:t>
-      </w:r>
-      <w:proofErr w:type="spellEnd"/>
-      <w:r>
-        <w:rPr>
-          <w:rFonts w:ascii="Times New Roman" w:hAnsi="Times New Roman" w:cs="Times New Roman"/>
-          <w:sz w:val="20"/>
-          <w:szCs w:val="20"/>
-          <w:lang w:val="de-DE"/>
-        </w:rPr>
-        <w:t>. 7</w:t>
+        <w:t>und Bl. 7</w:t>
       </w:r>
       <w:r>
         <w:rPr>
@@ -3424,25 +2875,14 @@
           <w:lang w:val="de-DE"/>
         </w:rPr>
       </w:pPr>
-      <w:proofErr w:type="spellStart"/>
-      <w:r>
-        <w:rPr>
-          <w:rFonts w:ascii="Times New Roman" w:hAnsi="Times New Roman" w:cs="Times New Roman"/>
-          <w:sz w:val="20"/>
-          <w:szCs w:val="20"/>
-          <w:lang w:val="de-DE"/>
-        </w:rPr>
-        <w:t>Bl</w:t>
-      </w:r>
-      <w:proofErr w:type="spellEnd"/>
-      <w:r>
-        <w:rPr>
-          <w:rFonts w:ascii="Times New Roman" w:hAnsi="Times New Roman" w:cs="Times New Roman"/>
-          <w:sz w:val="20"/>
-          <w:szCs w:val="20"/>
-          <w:lang w:val="de-DE"/>
-        </w:rPr>
-        <w:t>. 1</w:t>
+      <w:r>
+        <w:rPr>
+          <w:rFonts w:ascii="Times New Roman" w:hAnsi="Times New Roman" w:cs="Times New Roman"/>
+          <w:sz w:val="20"/>
+          <w:szCs w:val="20"/>
+          <w:lang w:val="de-DE"/>
+        </w:rPr>
+        <w:t>Bl. 1</w:t>
       </w:r>
       <w:r>
         <w:rPr>
@@ -3485,7 +2925,6 @@
           <w:lang w:val="de-DE"/>
         </w:rPr>
       </w:pPr>
-      <w:proofErr w:type="gramStart"/>
       <w:r>
         <w:rPr>
           <w:rFonts w:ascii="Times New Roman" w:hAnsi="Times New Roman" w:cs="Times New Roman"/>
@@ -3494,17 +2933,7 @@
           <w:lang w:val="de-DE"/>
         </w:rPr>
         <w:lastRenderedPageBreak/>
-        <w:t>Autograph</w:t>
-      </w:r>
-      <w:proofErr w:type="gramEnd"/>
-      <w:r>
-        <w:rPr>
-          <w:rFonts w:ascii="Times New Roman" w:hAnsi="Times New Roman" w:cs="Times New Roman"/>
-          <w:sz w:val="20"/>
-          <w:szCs w:val="20"/>
-          <w:lang w:val="de-DE"/>
-        </w:rPr>
-        <w:t xml:space="preserve"> von </w:t>
+        <w:t xml:space="preserve">Autograph von </w:t>
       </w:r>
       <w:r>
         <w:rPr>
@@ -3590,25 +3019,14 @@
           <w:lang w:val="de-DE"/>
         </w:rPr>
       </w:pPr>
-      <w:proofErr w:type="spellStart"/>
-      <w:r>
-        <w:rPr>
-          <w:rFonts w:ascii="Times New Roman" w:hAnsi="Times New Roman" w:cs="Times New Roman"/>
-          <w:sz w:val="20"/>
-          <w:szCs w:val="20"/>
-          <w:lang w:val="de-DE"/>
-        </w:rPr>
-        <w:t>Bl</w:t>
-      </w:r>
-      <w:proofErr w:type="spellEnd"/>
-      <w:r>
-        <w:rPr>
-          <w:rFonts w:ascii="Times New Roman" w:hAnsi="Times New Roman" w:cs="Times New Roman"/>
-          <w:sz w:val="20"/>
-          <w:szCs w:val="20"/>
-          <w:lang w:val="de-DE"/>
-        </w:rPr>
-        <w:t xml:space="preserve">. </w:t>
+      <w:r>
+        <w:rPr>
+          <w:rFonts w:ascii="Times New Roman" w:hAnsi="Times New Roman" w:cs="Times New Roman"/>
+          <w:sz w:val="20"/>
+          <w:szCs w:val="20"/>
+          <w:lang w:val="de-DE"/>
+        </w:rPr>
+        <w:t xml:space="preserve">Bl. </w:t>
       </w:r>
       <w:r>
         <w:rPr>
@@ -3808,25 +3226,14 @@
           <w:lang w:val="de-DE"/>
         </w:rPr>
       </w:pPr>
-      <w:proofErr w:type="spellStart"/>
-      <w:r>
-        <w:rPr>
-          <w:rFonts w:ascii="Times New Roman" w:hAnsi="Times New Roman" w:cs="Times New Roman"/>
-          <w:sz w:val="20"/>
-          <w:szCs w:val="20"/>
-          <w:lang w:val="de-DE"/>
-        </w:rPr>
-        <w:t>Bl</w:t>
-      </w:r>
-      <w:proofErr w:type="spellEnd"/>
-      <w:r>
-        <w:rPr>
-          <w:rFonts w:ascii="Times New Roman" w:hAnsi="Times New Roman" w:cs="Times New Roman"/>
-          <w:sz w:val="20"/>
-          <w:szCs w:val="20"/>
-          <w:lang w:val="de-DE"/>
-        </w:rPr>
-        <w:t xml:space="preserve">. </w:t>
+      <w:r>
+        <w:rPr>
+          <w:rFonts w:ascii="Times New Roman" w:hAnsi="Times New Roman" w:cs="Times New Roman"/>
+          <w:sz w:val="20"/>
+          <w:szCs w:val="20"/>
+          <w:lang w:val="de-DE"/>
+        </w:rPr>
+        <w:t xml:space="preserve">Bl. </w:t>
       </w:r>
       <w:r>
         <w:rPr>
@@ -3923,25 +3330,14 @@
           <w:lang w:val="de-DE"/>
         </w:rPr>
       </w:pPr>
-      <w:proofErr w:type="gramStart"/>
-      <w:r>
-        <w:rPr>
-          <w:rFonts w:ascii="Times New Roman" w:hAnsi="Times New Roman" w:cs="Times New Roman"/>
-          <w:sz w:val="20"/>
-          <w:szCs w:val="20"/>
-          <w:lang w:val="de-DE"/>
-        </w:rPr>
-        <w:t>Autograph</w:t>
-      </w:r>
-      <w:proofErr w:type="gramEnd"/>
-      <w:r>
-        <w:rPr>
-          <w:rFonts w:ascii="Times New Roman" w:hAnsi="Times New Roman" w:cs="Times New Roman"/>
-          <w:sz w:val="20"/>
-          <w:szCs w:val="20"/>
-          <w:lang w:val="de-DE"/>
-        </w:rPr>
-        <w:t xml:space="preserve"> von </w:t>
+      <w:r>
+        <w:rPr>
+          <w:rFonts w:ascii="Times New Roman" w:hAnsi="Times New Roman" w:cs="Times New Roman"/>
+          <w:sz w:val="20"/>
+          <w:szCs w:val="20"/>
+          <w:lang w:val="de-DE"/>
+        </w:rPr>
+        <w:t xml:space="preserve">Autograph von </w:t>
       </w:r>
       <w:r>
         <w:rPr>
@@ -4018,25 +3414,14 @@
           <w:lang w:val="de-DE"/>
         </w:rPr>
       </w:pPr>
-      <w:proofErr w:type="spellStart"/>
-      <w:r>
-        <w:rPr>
-          <w:rFonts w:ascii="Times New Roman" w:hAnsi="Times New Roman" w:cs="Times New Roman"/>
-          <w:sz w:val="20"/>
-          <w:szCs w:val="20"/>
-          <w:lang w:val="de-DE"/>
-        </w:rPr>
-        <w:t>Bl</w:t>
-      </w:r>
-      <w:proofErr w:type="spellEnd"/>
-      <w:r>
-        <w:rPr>
-          <w:rFonts w:ascii="Times New Roman" w:hAnsi="Times New Roman" w:cs="Times New Roman"/>
-          <w:sz w:val="20"/>
-          <w:szCs w:val="20"/>
-          <w:lang w:val="de-DE"/>
-        </w:rPr>
-        <w:t xml:space="preserve">. </w:t>
+      <w:r>
+        <w:rPr>
+          <w:rFonts w:ascii="Times New Roman" w:hAnsi="Times New Roman" w:cs="Times New Roman"/>
+          <w:sz w:val="20"/>
+          <w:szCs w:val="20"/>
+          <w:lang w:val="de-DE"/>
+        </w:rPr>
+        <w:t xml:space="preserve">Bl. </w:t>
       </w:r>
       <w:r>
         <w:rPr>
@@ -4294,25 +3679,14 @@
           <w:lang w:val="de-DE"/>
         </w:rPr>
       </w:pPr>
-      <w:proofErr w:type="spellStart"/>
-      <w:r>
-        <w:rPr>
-          <w:rFonts w:ascii="Times New Roman" w:hAnsi="Times New Roman" w:cs="Times New Roman"/>
-          <w:sz w:val="20"/>
-          <w:szCs w:val="20"/>
-          <w:lang w:val="de-DE"/>
-        </w:rPr>
-        <w:t>Bl</w:t>
-      </w:r>
-      <w:proofErr w:type="spellEnd"/>
-      <w:r>
-        <w:rPr>
-          <w:rFonts w:ascii="Times New Roman" w:hAnsi="Times New Roman" w:cs="Times New Roman"/>
-          <w:sz w:val="20"/>
-          <w:szCs w:val="20"/>
-          <w:lang w:val="de-DE"/>
-        </w:rPr>
-        <w:t xml:space="preserve">. </w:t>
+      <w:r>
+        <w:rPr>
+          <w:rFonts w:ascii="Times New Roman" w:hAnsi="Times New Roman" w:cs="Times New Roman"/>
+          <w:sz w:val="20"/>
+          <w:szCs w:val="20"/>
+          <w:lang w:val="de-DE"/>
+        </w:rPr>
+        <w:t xml:space="preserve">Bl. </w:t>
       </w:r>
       <w:r>
         <w:rPr>
@@ -4606,25 +3980,14 @@
           <w:lang w:val="de-DE"/>
         </w:rPr>
       </w:pPr>
-      <w:proofErr w:type="spellStart"/>
-      <w:r>
-        <w:rPr>
-          <w:rFonts w:ascii="Times New Roman" w:hAnsi="Times New Roman" w:cs="Times New Roman"/>
-          <w:sz w:val="20"/>
-          <w:szCs w:val="20"/>
-          <w:lang w:val="de-DE"/>
-        </w:rPr>
-        <w:t>Bl</w:t>
-      </w:r>
-      <w:proofErr w:type="spellEnd"/>
-      <w:r>
-        <w:rPr>
-          <w:rFonts w:ascii="Times New Roman" w:hAnsi="Times New Roman" w:cs="Times New Roman"/>
-          <w:sz w:val="20"/>
-          <w:szCs w:val="20"/>
-          <w:lang w:val="de-DE"/>
-        </w:rPr>
-        <w:t xml:space="preserve">. </w:t>
+      <w:r>
+        <w:rPr>
+          <w:rFonts w:ascii="Times New Roman" w:hAnsi="Times New Roman" w:cs="Times New Roman"/>
+          <w:sz w:val="20"/>
+          <w:szCs w:val="20"/>
+          <w:lang w:val="de-DE"/>
+        </w:rPr>
+        <w:t xml:space="preserve">Bl. </w:t>
       </w:r>
       <w:r>
         <w:rPr>
@@ -4918,25 +4281,14 @@
           <w:lang w:val="de-DE"/>
         </w:rPr>
       </w:pPr>
-      <w:proofErr w:type="spellStart"/>
-      <w:r>
-        <w:rPr>
-          <w:rFonts w:ascii="Times New Roman" w:hAnsi="Times New Roman" w:cs="Times New Roman"/>
-          <w:sz w:val="20"/>
-          <w:szCs w:val="20"/>
-          <w:lang w:val="de-DE"/>
-        </w:rPr>
-        <w:t>Bl</w:t>
-      </w:r>
-      <w:proofErr w:type="spellEnd"/>
-      <w:r>
-        <w:rPr>
-          <w:rFonts w:ascii="Times New Roman" w:hAnsi="Times New Roman" w:cs="Times New Roman"/>
-          <w:sz w:val="20"/>
-          <w:szCs w:val="20"/>
-          <w:lang w:val="de-DE"/>
-        </w:rPr>
-        <w:t xml:space="preserve">. </w:t>
+      <w:r>
+        <w:rPr>
+          <w:rFonts w:ascii="Times New Roman" w:hAnsi="Times New Roman" w:cs="Times New Roman"/>
+          <w:sz w:val="20"/>
+          <w:szCs w:val="20"/>
+          <w:lang w:val="de-DE"/>
+        </w:rPr>
+        <w:t xml:space="preserve">Bl. </w:t>
       </w:r>
       <w:r>
         <w:rPr>
@@ -5145,25 +4497,14 @@
           <w:lang w:val="de-DE"/>
         </w:rPr>
       </w:pPr>
-      <w:proofErr w:type="gramStart"/>
-      <w:r>
-        <w:rPr>
-          <w:rFonts w:ascii="Times New Roman" w:hAnsi="Times New Roman" w:cs="Times New Roman"/>
-          <w:sz w:val="20"/>
-          <w:szCs w:val="20"/>
-          <w:lang w:val="de-DE"/>
-        </w:rPr>
-        <w:t>Autograph</w:t>
-      </w:r>
-      <w:proofErr w:type="gramEnd"/>
-      <w:r>
-        <w:rPr>
-          <w:rFonts w:ascii="Times New Roman" w:hAnsi="Times New Roman" w:cs="Times New Roman"/>
-          <w:sz w:val="20"/>
-          <w:szCs w:val="20"/>
-          <w:lang w:val="de-DE"/>
-        </w:rPr>
-        <w:t xml:space="preserve"> von </w:t>
+      <w:r>
+        <w:rPr>
+          <w:rFonts w:ascii="Times New Roman" w:hAnsi="Times New Roman" w:cs="Times New Roman"/>
+          <w:sz w:val="20"/>
+          <w:szCs w:val="20"/>
+          <w:lang w:val="de-DE"/>
+        </w:rPr>
+        <w:t xml:space="preserve">Autograph von </w:t>
       </w:r>
       <w:r>
         <w:rPr>
@@ -5240,25 +4581,14 @@
           <w:lang w:val="de-DE"/>
         </w:rPr>
       </w:pPr>
-      <w:proofErr w:type="spellStart"/>
-      <w:r>
-        <w:rPr>
-          <w:rFonts w:ascii="Times New Roman" w:hAnsi="Times New Roman" w:cs="Times New Roman"/>
-          <w:sz w:val="20"/>
-          <w:szCs w:val="20"/>
-          <w:lang w:val="de-DE"/>
-        </w:rPr>
-        <w:t>Bl</w:t>
-      </w:r>
-      <w:proofErr w:type="spellEnd"/>
-      <w:r>
-        <w:rPr>
-          <w:rFonts w:ascii="Times New Roman" w:hAnsi="Times New Roman" w:cs="Times New Roman"/>
-          <w:sz w:val="20"/>
-          <w:szCs w:val="20"/>
-          <w:lang w:val="de-DE"/>
-        </w:rPr>
-        <w:t xml:space="preserve">. </w:t>
+      <w:r>
+        <w:rPr>
+          <w:rFonts w:ascii="Times New Roman" w:hAnsi="Times New Roman" w:cs="Times New Roman"/>
+          <w:sz w:val="20"/>
+          <w:szCs w:val="20"/>
+          <w:lang w:val="de-DE"/>
+        </w:rPr>
+        <w:t xml:space="preserve">Bl. </w:t>
       </w:r>
       <w:r>
         <w:rPr>
@@ -5552,25 +4882,14 @@
           <w:lang w:val="de-DE"/>
         </w:rPr>
       </w:pPr>
-      <w:proofErr w:type="gramStart"/>
-      <w:r>
-        <w:rPr>
-          <w:rFonts w:ascii="Times New Roman" w:hAnsi="Times New Roman" w:cs="Times New Roman"/>
-          <w:sz w:val="20"/>
-          <w:szCs w:val="20"/>
-          <w:lang w:val="de-DE"/>
-        </w:rPr>
-        <w:t>Autograph</w:t>
-      </w:r>
-      <w:proofErr w:type="gramEnd"/>
-      <w:r>
-        <w:rPr>
-          <w:rFonts w:ascii="Times New Roman" w:hAnsi="Times New Roman" w:cs="Times New Roman"/>
-          <w:sz w:val="20"/>
-          <w:szCs w:val="20"/>
-          <w:lang w:val="de-DE"/>
-        </w:rPr>
-        <w:t xml:space="preserve"> von </w:t>
+      <w:r>
+        <w:rPr>
+          <w:rFonts w:ascii="Times New Roman" w:hAnsi="Times New Roman" w:cs="Times New Roman"/>
+          <w:sz w:val="20"/>
+          <w:szCs w:val="20"/>
+          <w:lang w:val="de-DE"/>
+        </w:rPr>
+        <w:t xml:space="preserve">Autograph von </w:t>
       </w:r>
       <w:r>
         <w:rPr>
@@ -5647,25 +4966,14 @@
           <w:lang w:val="de-DE"/>
         </w:rPr>
       </w:pPr>
-      <w:proofErr w:type="spellStart"/>
-      <w:r>
-        <w:rPr>
-          <w:rFonts w:ascii="Times New Roman" w:hAnsi="Times New Roman" w:cs="Times New Roman"/>
-          <w:sz w:val="20"/>
-          <w:szCs w:val="20"/>
-          <w:lang w:val="de-DE"/>
-        </w:rPr>
-        <w:t>Bl</w:t>
-      </w:r>
-      <w:proofErr w:type="spellEnd"/>
-      <w:r>
-        <w:rPr>
-          <w:rFonts w:ascii="Times New Roman" w:hAnsi="Times New Roman" w:cs="Times New Roman"/>
-          <w:sz w:val="20"/>
-          <w:szCs w:val="20"/>
-          <w:lang w:val="de-DE"/>
-        </w:rPr>
-        <w:t xml:space="preserve">. </w:t>
+      <w:r>
+        <w:rPr>
+          <w:rFonts w:ascii="Times New Roman" w:hAnsi="Times New Roman" w:cs="Times New Roman"/>
+          <w:sz w:val="20"/>
+          <w:szCs w:val="20"/>
+          <w:lang w:val="de-DE"/>
+        </w:rPr>
+        <w:t xml:space="preserve">Bl. </w:t>
       </w:r>
       <w:r>
         <w:rPr>
@@ -5977,25 +5285,14 @@
           <w:lang w:val="de-DE"/>
         </w:rPr>
       </w:pPr>
-      <w:proofErr w:type="spellStart"/>
-      <w:r>
-        <w:rPr>
-          <w:rFonts w:ascii="Times New Roman" w:hAnsi="Times New Roman" w:cs="Times New Roman"/>
-          <w:sz w:val="20"/>
-          <w:szCs w:val="20"/>
-          <w:lang w:val="de-DE"/>
-        </w:rPr>
-        <w:t>Bl</w:t>
-      </w:r>
-      <w:proofErr w:type="spellEnd"/>
-      <w:r>
-        <w:rPr>
-          <w:rFonts w:ascii="Times New Roman" w:hAnsi="Times New Roman" w:cs="Times New Roman"/>
-          <w:sz w:val="20"/>
-          <w:szCs w:val="20"/>
-          <w:lang w:val="de-DE"/>
-        </w:rPr>
-        <w:t xml:space="preserve">. </w:t>
+      <w:r>
+        <w:rPr>
+          <w:rFonts w:ascii="Times New Roman" w:hAnsi="Times New Roman" w:cs="Times New Roman"/>
+          <w:sz w:val="20"/>
+          <w:szCs w:val="20"/>
+          <w:lang w:val="de-DE"/>
+        </w:rPr>
+        <w:t xml:space="preserve">Bl. </w:t>
       </w:r>
       <w:r>
         <w:rPr>
@@ -6595,37 +5892,16 @@
                 <w:highlight w:val="red"/>
                 <w:lang w:val="de-DE"/>
               </w:rPr>
-              <w:t>##</w:t>
-            </w:r>
-            <w:proofErr w:type="gramStart"/>
-            <w:r>
-              <w:rPr>
-                <w:rFonts w:ascii="Times New Roman" w:hAnsi="Times New Roman" w:cs="Times New Roman"/>
-                <w:sz w:val="20"/>
-                <w:szCs w:val="20"/>
-                <w:highlight w:val="red"/>
-                <w:lang w:val="de-DE"/>
-              </w:rPr>
-              <w:t>#</w:t>
-            </w:r>
-            <w:r>
-              <w:rPr>
-                <w:rFonts w:ascii="Times New Roman" w:hAnsi="Times New Roman" w:cs="Times New Roman"/>
-                <w:sz w:val="20"/>
-                <w:szCs w:val="20"/>
-                <w:lang w:val="de-DE"/>
-              </w:rPr>
-              <w:t>(</w:t>
-            </w:r>
-            <w:proofErr w:type="gramEnd"/>
-            <w:r>
-              <w:rPr>
-                <w:rFonts w:ascii="Times New Roman" w:hAnsi="Times New Roman" w:cs="Times New Roman"/>
-                <w:sz w:val="20"/>
-                <w:szCs w:val="20"/>
-                <w:lang w:val="de-DE"/>
-              </w:rPr>
-              <w:t>M 1</w:t>
+              <w:t>###</w:t>
+            </w:r>
+            <w:r>
+              <w:rPr>
+                <w:rFonts w:ascii="Times New Roman" w:hAnsi="Times New Roman" w:cs="Times New Roman"/>
+                <w:sz w:val="20"/>
+                <w:szCs w:val="20"/>
+                <w:lang w:val="de-DE"/>
+              </w:rPr>
+              <w:t>(M 1</w:t>
             </w:r>
             <w:r>
               <w:rPr>
@@ -6776,27 +6052,7 @@
                 <w:szCs w:val="20"/>
                 <w:lang w:val="de-DE"/>
               </w:rPr>
-              <w:t>(</w:t>
-            </w:r>
-            <w:proofErr w:type="spellStart"/>
-            <w:r>
-              <w:rPr>
-                <w:rFonts w:ascii="Times New Roman" w:hAnsi="Times New Roman" w:cs="Times New Roman"/>
-                <w:sz w:val="20"/>
-                <w:szCs w:val="20"/>
-                <w:lang w:val="de-DE"/>
-              </w:rPr>
-              <w:t>Triolische</w:t>
-            </w:r>
-            <w:proofErr w:type="spellEnd"/>
-            <w:r>
-              <w:rPr>
-                <w:rFonts w:ascii="Times New Roman" w:hAnsi="Times New Roman" w:cs="Times New Roman"/>
-                <w:sz w:val="20"/>
-                <w:szCs w:val="20"/>
-                <w:lang w:val="de-DE"/>
-              </w:rPr>
-              <w:t>) Achtelpause überschreibt Viertelpause.</w:t>
+              <w:t>(Triolische) Achtelpause überschreibt Viertelpause.</w:t>
             </w:r>
           </w:p>
         </w:tc>
@@ -7524,27 +6780,7 @@
                 <w:szCs w:val="20"/>
                 <w:lang w:val="de-DE"/>
               </w:rPr>
-              <w:t xml:space="preserve">Auf Rasur. Ante </w:t>
-            </w:r>
-            <w:proofErr w:type="spellStart"/>
-            <w:r>
-              <w:rPr>
-                <w:rFonts w:ascii="Times New Roman" w:hAnsi="Times New Roman" w:cs="Times New Roman"/>
-                <w:sz w:val="20"/>
-                <w:szCs w:val="20"/>
-                <w:lang w:val="de-DE"/>
-              </w:rPr>
-              <w:t>correcturam</w:t>
-            </w:r>
-            <w:proofErr w:type="spellEnd"/>
-            <w:r>
-              <w:rPr>
-                <w:rFonts w:ascii="Times New Roman" w:hAnsi="Times New Roman" w:cs="Times New Roman"/>
-                <w:sz w:val="20"/>
-                <w:szCs w:val="20"/>
-                <w:lang w:val="de-DE"/>
-              </w:rPr>
-              <w:t xml:space="preserve">: e. </w:t>
+              <w:t xml:space="preserve">Auf Rasur. Ante correcturam: e. </w:t>
             </w:r>
           </w:p>
         </w:tc>
@@ -7729,23 +6965,13 @@
               </w:rPr>
               <w:t>1</w:t>
             </w:r>
-            <w:proofErr w:type="gramStart"/>
-            <w:r>
-              <w:rPr>
-                <w:rFonts w:ascii="Times New Roman" w:hAnsi="Times New Roman" w:cs="Times New Roman"/>
-                <w:sz w:val="20"/>
-                <w:szCs w:val="20"/>
-              </w:rPr>
-              <w:t>?]–</w:t>
-            </w:r>
-            <w:proofErr w:type="gramEnd"/>
-            <w:r>
-              <w:rPr>
-                <w:rFonts w:ascii="Times New Roman" w:hAnsi="Times New Roman" w:cs="Times New Roman"/>
-                <w:sz w:val="20"/>
-                <w:szCs w:val="20"/>
-              </w:rPr>
-              <w:t>a</w:t>
+            <w:r>
+              <w:rPr>
+                <w:rFonts w:ascii="Times New Roman" w:hAnsi="Times New Roman" w:cs="Times New Roman"/>
+                <w:sz w:val="20"/>
+                <w:szCs w:val="20"/>
+              </w:rPr>
+              <w:t>?]–a</w:t>
             </w:r>
             <w:r>
               <w:rPr>
@@ -7795,25 +7021,7 @@
                 <w:sz w:val="20"/>
                 <w:szCs w:val="20"/>
               </w:rPr>
-              <w:t xml:space="preserve"> mit </w:t>
-            </w:r>
-            <w:proofErr w:type="spellStart"/>
-            <w:r>
-              <w:rPr>
-                <w:rFonts w:ascii="Times New Roman" w:hAnsi="Times New Roman" w:cs="Times New Roman"/>
-                <w:sz w:val="20"/>
-                <w:szCs w:val="20"/>
-              </w:rPr>
-              <w:t>Ligaturbögen</w:t>
-            </w:r>
-            <w:proofErr w:type="spellEnd"/>
-            <w:r>
-              <w:rPr>
-                <w:rFonts w:ascii="Times New Roman" w:hAnsi="Times New Roman" w:cs="Times New Roman"/>
-                <w:sz w:val="20"/>
-                <w:szCs w:val="20"/>
-              </w:rPr>
-              <w:t xml:space="preserve"> zu a[?]/d</w:t>
+              <w:t xml:space="preserve"> mit Ligaturbögen zu a[?]/d</w:t>
             </w:r>
             <w:r>
               <w:rPr>
@@ -8505,37 +7713,16 @@
                 <w:highlight w:val="red"/>
                 <w:lang w:val="de-DE"/>
               </w:rPr>
-              <w:t>##</w:t>
-            </w:r>
-            <w:proofErr w:type="gramStart"/>
-            <w:r>
-              <w:rPr>
-                <w:rFonts w:ascii="Times New Roman" w:hAnsi="Times New Roman" w:cs="Times New Roman"/>
-                <w:sz w:val="20"/>
-                <w:szCs w:val="20"/>
-                <w:highlight w:val="red"/>
-                <w:lang w:val="de-DE"/>
-              </w:rPr>
-              <w:t>#</w:t>
-            </w:r>
-            <w:r>
-              <w:rPr>
-                <w:rFonts w:ascii="Times New Roman" w:hAnsi="Times New Roman" w:cs="Times New Roman"/>
-                <w:sz w:val="20"/>
-                <w:szCs w:val="20"/>
-                <w:lang w:val="de-DE"/>
-              </w:rPr>
-              <w:t>(</w:t>
-            </w:r>
-            <w:proofErr w:type="gramEnd"/>
-            <w:r>
-              <w:rPr>
-                <w:rFonts w:ascii="Times New Roman" w:hAnsi="Times New Roman" w:cs="Times New Roman"/>
-                <w:sz w:val="20"/>
-                <w:szCs w:val="20"/>
-                <w:lang w:val="de-DE"/>
-              </w:rPr>
-              <w:t>M 162: Textfassung 1)</w:t>
+              <w:t>###</w:t>
+            </w:r>
+            <w:r>
+              <w:rPr>
+                <w:rFonts w:ascii="Times New Roman" w:hAnsi="Times New Roman" w:cs="Times New Roman"/>
+                <w:sz w:val="20"/>
+                <w:szCs w:val="20"/>
+                <w:lang w:val="de-DE"/>
+              </w:rPr>
+              <w:t>(M 162: Textfassung 1)</w:t>
             </w:r>
           </w:p>
         </w:tc>
@@ -10301,25 +9488,7 @@
                 <w:sz w:val="20"/>
                 <w:szCs w:val="20"/>
               </w:rPr>
-              <w:t xml:space="preserve">Ante </w:t>
-            </w:r>
-            <w:proofErr w:type="spellStart"/>
-            <w:r>
-              <w:rPr>
-                <w:rFonts w:ascii="Times New Roman" w:hAnsi="Times New Roman" w:cs="Times New Roman"/>
-                <w:sz w:val="20"/>
-                <w:szCs w:val="20"/>
-              </w:rPr>
-              <w:t>correcturam</w:t>
-            </w:r>
-            <w:proofErr w:type="spellEnd"/>
-            <w:r>
-              <w:rPr>
-                <w:rFonts w:ascii="Times New Roman" w:hAnsi="Times New Roman" w:cs="Times New Roman"/>
-                <w:sz w:val="20"/>
-                <w:szCs w:val="20"/>
-              </w:rPr>
-              <w:t>: [b]Es/H/[a]e/[a]g oder H/[a]e/[a]g?</w:t>
+              <w:t>Ante correcturam: [b]Es/H/[a]e/[a]g oder H/[a]e/[a]g?</w:t>
             </w:r>
           </w:p>
         </w:tc>
@@ -10366,37 +9535,16 @@
                 <w:highlight w:val="red"/>
                 <w:lang w:val="de-DE"/>
               </w:rPr>
-              <w:t>##</w:t>
-            </w:r>
-            <w:proofErr w:type="gramStart"/>
-            <w:r>
-              <w:rPr>
-                <w:rFonts w:ascii="Times New Roman" w:hAnsi="Times New Roman" w:cs="Times New Roman"/>
-                <w:sz w:val="20"/>
-                <w:szCs w:val="20"/>
-                <w:highlight w:val="red"/>
-                <w:lang w:val="de-DE"/>
-              </w:rPr>
-              <w:t>#</w:t>
-            </w:r>
-            <w:r>
-              <w:rPr>
-                <w:rFonts w:ascii="Times New Roman" w:hAnsi="Times New Roman" w:cs="Times New Roman"/>
-                <w:sz w:val="20"/>
-                <w:szCs w:val="20"/>
-                <w:lang w:val="de-DE"/>
-              </w:rPr>
-              <w:t>(</w:t>
-            </w:r>
-            <w:proofErr w:type="gramEnd"/>
-            <w:r>
-              <w:rPr>
-                <w:rFonts w:ascii="Times New Roman" w:hAnsi="Times New Roman" w:cs="Times New Roman"/>
-                <w:sz w:val="20"/>
-                <w:szCs w:val="20"/>
-                <w:lang w:val="de-DE"/>
-              </w:rPr>
-              <w:t>M 163: Textfassung 1)</w:t>
+              <w:t>###</w:t>
+            </w:r>
+            <w:r>
+              <w:rPr>
+                <w:rFonts w:ascii="Times New Roman" w:hAnsi="Times New Roman" w:cs="Times New Roman"/>
+                <w:sz w:val="20"/>
+                <w:szCs w:val="20"/>
+                <w:lang w:val="de-DE"/>
+              </w:rPr>
+              <w:t>(M 163: Textfassung 1)</w:t>
             </w:r>
           </w:p>
         </w:tc>
@@ -11135,37 +10283,16 @@
                 <w:highlight w:val="red"/>
                 <w:lang w:val="de-DE"/>
               </w:rPr>
-              <w:t>##</w:t>
-            </w:r>
-            <w:proofErr w:type="gramStart"/>
-            <w:r>
-              <w:rPr>
-                <w:rFonts w:ascii="Times New Roman" w:hAnsi="Times New Roman" w:cs="Times New Roman"/>
-                <w:sz w:val="20"/>
-                <w:szCs w:val="20"/>
-                <w:highlight w:val="red"/>
-                <w:lang w:val="de-DE"/>
-              </w:rPr>
-              <w:t>#</w:t>
-            </w:r>
-            <w:r>
-              <w:rPr>
-                <w:rFonts w:ascii="Times New Roman" w:hAnsi="Times New Roman" w:cs="Times New Roman"/>
-                <w:sz w:val="20"/>
-                <w:szCs w:val="20"/>
-                <w:lang w:val="de-DE"/>
-              </w:rPr>
-              <w:t>(</w:t>
-            </w:r>
-            <w:proofErr w:type="gramEnd"/>
-            <w:r>
-              <w:rPr>
-                <w:rFonts w:ascii="Times New Roman" w:hAnsi="Times New Roman" w:cs="Times New Roman"/>
-                <w:sz w:val="20"/>
-                <w:szCs w:val="20"/>
-                <w:lang w:val="de-DE"/>
-              </w:rPr>
-              <w:t>M 164: Textfassung 1)</w:t>
+              <w:t>###</w:t>
+            </w:r>
+            <w:r>
+              <w:rPr>
+                <w:rFonts w:ascii="Times New Roman" w:hAnsi="Times New Roman" w:cs="Times New Roman"/>
+                <w:sz w:val="20"/>
+                <w:szCs w:val="20"/>
+                <w:lang w:val="de-DE"/>
+              </w:rPr>
+              <w:t>(M 164: Textfassung 1)</w:t>
             </w:r>
           </w:p>
         </w:tc>
@@ -11290,25 +10417,7 @@
                 <w:sz w:val="20"/>
                 <w:szCs w:val="20"/>
               </w:rPr>
-              <w:t xml:space="preserve">Rasur. Ante </w:t>
-            </w:r>
-            <w:proofErr w:type="spellStart"/>
-            <w:r>
-              <w:rPr>
-                <w:rFonts w:ascii="Times New Roman" w:hAnsi="Times New Roman" w:cs="Times New Roman"/>
-                <w:sz w:val="20"/>
-                <w:szCs w:val="20"/>
-              </w:rPr>
-              <w:t>correcturam</w:t>
-            </w:r>
-            <w:proofErr w:type="spellEnd"/>
-            <w:r>
-              <w:rPr>
-                <w:rFonts w:ascii="Times New Roman" w:hAnsi="Times New Roman" w:cs="Times New Roman"/>
-                <w:sz w:val="20"/>
-                <w:szCs w:val="20"/>
-              </w:rPr>
-              <w:t>: [a]F?</w:t>
+              <w:t>Rasur. Ante correcturam: [a]F?</w:t>
             </w:r>
           </w:p>
         </w:tc>
@@ -12228,37 +11337,16 @@
                 <w:highlight w:val="red"/>
                 <w:lang w:val="de-DE"/>
               </w:rPr>
-              <w:t>##</w:t>
-            </w:r>
-            <w:proofErr w:type="gramStart"/>
-            <w:r>
-              <w:rPr>
-                <w:rFonts w:ascii="Times New Roman" w:hAnsi="Times New Roman" w:cs="Times New Roman"/>
-                <w:sz w:val="20"/>
-                <w:szCs w:val="20"/>
-                <w:highlight w:val="red"/>
-                <w:lang w:val="de-DE"/>
-              </w:rPr>
-              <w:t>#</w:t>
-            </w:r>
-            <w:r>
-              <w:rPr>
-                <w:rFonts w:ascii="Times New Roman" w:hAnsi="Times New Roman" w:cs="Times New Roman"/>
-                <w:sz w:val="20"/>
-                <w:szCs w:val="20"/>
-                <w:lang w:val="de-DE"/>
-              </w:rPr>
-              <w:t>(</w:t>
-            </w:r>
-            <w:proofErr w:type="gramEnd"/>
-            <w:r>
-              <w:rPr>
-                <w:rFonts w:ascii="Times New Roman" w:hAnsi="Times New Roman" w:cs="Times New Roman"/>
-                <w:sz w:val="20"/>
-                <w:szCs w:val="20"/>
-                <w:lang w:val="de-DE"/>
-              </w:rPr>
-              <w:t>M 162: Textfassung 1)</w:t>
+              <w:t>###</w:t>
+            </w:r>
+            <w:r>
+              <w:rPr>
+                <w:rFonts w:ascii="Times New Roman" w:hAnsi="Times New Roman" w:cs="Times New Roman"/>
+                <w:sz w:val="20"/>
+                <w:szCs w:val="20"/>
+                <w:lang w:val="de-DE"/>
+              </w:rPr>
+              <w:t>(M 162: Textfassung 1)</w:t>
             </w:r>
           </w:p>
         </w:tc>
@@ -13161,25 +12249,14 @@
                 <w:lang w:val="de-DE"/>
               </w:rPr>
             </w:pPr>
-            <w:proofErr w:type="spellStart"/>
-            <w:r>
-              <w:rPr>
-                <w:rFonts w:ascii="Times New Roman" w:hAnsi="Times New Roman" w:cs="Times New Roman"/>
-                <w:sz w:val="20"/>
-                <w:szCs w:val="20"/>
-                <w:lang w:val="de-DE"/>
-              </w:rPr>
-              <w:t>Triolische</w:t>
-            </w:r>
-            <w:proofErr w:type="spellEnd"/>
-            <w:r>
-              <w:rPr>
-                <w:rFonts w:ascii="Times New Roman" w:hAnsi="Times New Roman" w:cs="Times New Roman"/>
-                <w:sz w:val="20"/>
-                <w:szCs w:val="20"/>
-                <w:lang w:val="de-DE"/>
-              </w:rPr>
-              <w:t xml:space="preserve"> Achtelpause, Achtelnote E, Achtelpause </w:t>
+            <w:r>
+              <w:rPr>
+                <w:rFonts w:ascii="Times New Roman" w:hAnsi="Times New Roman" w:cs="Times New Roman"/>
+                <w:sz w:val="20"/>
+                <w:szCs w:val="20"/>
+                <w:lang w:val="de-DE"/>
+              </w:rPr>
+              <w:t xml:space="preserve">Triolische Achtelpause, Achtelnote E, Achtelpause </w:t>
             </w:r>
             <w:r>
               <w:rPr>
@@ -13397,7 +12474,6 @@
               </w:rPr>
               <w:t xml:space="preserve">Zuerst: </w:t>
             </w:r>
-            <w:proofErr w:type="spellStart"/>
             <w:r>
               <w:rPr>
                 <w:rFonts w:ascii="Times New Roman" w:hAnsi="Times New Roman" w:cs="Times New Roman"/>
@@ -13409,7 +12485,6 @@
               </w:rPr>
               <w:t>rit</w:t>
             </w:r>
-            <w:proofErr w:type="spellEnd"/>
             <w:r>
               <w:rPr>
                 <w:rFonts w:ascii="Times New Roman" w:hAnsi="Times New Roman" w:cs="Times New Roman"/>
@@ -13609,27 +12684,7 @@
                 <w:szCs w:val="20"/>
                 <w:lang w:val="de-DE"/>
               </w:rPr>
-              <w:t>[sf] geändert zu [</w:t>
-            </w:r>
-            <w:proofErr w:type="spellStart"/>
-            <w:r>
-              <w:rPr>
-                <w:rFonts w:ascii="Times New Roman" w:hAnsi="Times New Roman" w:cs="Times New Roman"/>
-                <w:sz w:val="20"/>
-                <w:szCs w:val="20"/>
-                <w:lang w:val="de-DE"/>
-              </w:rPr>
-              <w:t>sfp</w:t>
-            </w:r>
-            <w:proofErr w:type="spellEnd"/>
-            <w:r>
-              <w:rPr>
-                <w:rFonts w:ascii="Times New Roman" w:hAnsi="Times New Roman" w:cs="Times New Roman"/>
-                <w:sz w:val="20"/>
-                <w:szCs w:val="20"/>
-                <w:lang w:val="de-DE"/>
-              </w:rPr>
-              <w:t>] (wie Textfassung 3) mit rotem Buntstift.</w:t>
+              <w:t>[sf] geändert zu [sfp] (wie Textfassung 3) mit rotem Buntstift.</w:t>
             </w:r>
           </w:p>
         </w:tc>
@@ -13928,45 +12983,14 @@
                 <w:lang w:val="de-DE"/>
               </w:rPr>
             </w:pPr>
-            <w:proofErr w:type="spellStart"/>
-            <w:r>
-              <w:rPr>
-                <w:rFonts w:ascii="Times New Roman" w:hAnsi="Times New Roman" w:cs="Times New Roman"/>
-                <w:sz w:val="20"/>
-                <w:szCs w:val="20"/>
-                <w:lang w:val="de-DE"/>
-              </w:rPr>
-              <w:t>Legatobögen</w:t>
-            </w:r>
-            <w:proofErr w:type="spellEnd"/>
-            <w:r>
-              <w:rPr>
-                <w:rFonts w:ascii="Times New Roman" w:hAnsi="Times New Roman" w:cs="Times New Roman"/>
-                <w:sz w:val="20"/>
-                <w:szCs w:val="20"/>
-                <w:lang w:val="de-DE"/>
-              </w:rPr>
-              <w:t xml:space="preserve"> geändert entweder zu Staccatopunkten oder </w:t>
-            </w:r>
-            <w:proofErr w:type="spellStart"/>
-            <w:r>
-              <w:rPr>
-                <w:rFonts w:ascii="Times New Roman" w:hAnsi="Times New Roman" w:cs="Times New Roman"/>
-                <w:sz w:val="20"/>
-                <w:szCs w:val="20"/>
-                <w:lang w:val="de-DE"/>
-              </w:rPr>
-              <w:t>Legatobögen</w:t>
-            </w:r>
-            <w:proofErr w:type="spellEnd"/>
-            <w:r>
-              <w:rPr>
-                <w:rFonts w:ascii="Times New Roman" w:hAnsi="Times New Roman" w:cs="Times New Roman"/>
-                <w:sz w:val="20"/>
-                <w:szCs w:val="20"/>
-                <w:lang w:val="de-DE"/>
-              </w:rPr>
-              <w:t xml:space="preserve"> in Klav. u. T. 4 1.–2. Note und Klav. o. T. 4 7.–8. Note (</w:t>
+            <w:r>
+              <w:rPr>
+                <w:rFonts w:ascii="Times New Roman" w:hAnsi="Times New Roman" w:cs="Times New Roman"/>
+                <w:sz w:val="20"/>
+                <w:szCs w:val="20"/>
+                <w:lang w:val="de-DE"/>
+              </w:rPr>
+              <w:t>Legatobögen geändert entweder zu Staccatopunkten oder Legatobögen in Klav. u. T. 4 1.–2. Note und Klav. o. T. 4 7.–8. Note (</w:t>
             </w:r>
             <w:r>
               <w:rPr>
@@ -14618,27 +13642,7 @@
                 <w:szCs w:val="20"/>
                 <w:lang w:val="de-DE"/>
               </w:rPr>
-              <w:t xml:space="preserve">Ausdehnung des </w:t>
-            </w:r>
-            <w:proofErr w:type="spellStart"/>
-            <w:r>
-              <w:rPr>
-                <w:rFonts w:ascii="Times New Roman" w:hAnsi="Times New Roman" w:cs="Times New Roman"/>
-                <w:sz w:val="20"/>
-                <w:szCs w:val="20"/>
-                <w:lang w:val="de-DE"/>
-              </w:rPr>
-              <w:t>Legatobogens</w:t>
-            </w:r>
-            <w:proofErr w:type="spellEnd"/>
-            <w:r>
-              <w:rPr>
-                <w:rFonts w:ascii="Times New Roman" w:hAnsi="Times New Roman" w:cs="Times New Roman"/>
-                <w:sz w:val="20"/>
-                <w:szCs w:val="20"/>
-                <w:lang w:val="de-DE"/>
-              </w:rPr>
-              <w:t xml:space="preserve"> geändert zu 1.–3. Note in Klav. u.</w:t>
+              <w:t>Ausdehnung des Legatobogens geändert zu 1.–3. Note in Klav. u.</w:t>
             </w:r>
             <w:r>
               <w:rPr>
@@ -15079,27 +14083,7 @@
                 <w:szCs w:val="20"/>
                 <w:lang w:val="de-DE"/>
               </w:rPr>
-              <w:t xml:space="preserve">Ausdehnung des </w:t>
-            </w:r>
-            <w:proofErr w:type="spellStart"/>
-            <w:r>
-              <w:rPr>
-                <w:rFonts w:ascii="Times New Roman" w:hAnsi="Times New Roman" w:cs="Times New Roman"/>
-                <w:sz w:val="20"/>
-                <w:szCs w:val="20"/>
-                <w:lang w:val="de-DE"/>
-              </w:rPr>
-              <w:t>Legatobogens</w:t>
-            </w:r>
-            <w:proofErr w:type="spellEnd"/>
-            <w:r>
-              <w:rPr>
-                <w:rFonts w:ascii="Times New Roman" w:hAnsi="Times New Roman" w:cs="Times New Roman"/>
-                <w:sz w:val="20"/>
-                <w:szCs w:val="20"/>
-                <w:lang w:val="de-DE"/>
-              </w:rPr>
-              <w:t xml:space="preserve"> geändert zu Klav. u. T. 5 8/16 bis T. 6 1</w:t>
+              <w:t>Ausdehnung des Legatobogens geändert zu Klav. u. T. 5 8/16 bis T. 6 1</w:t>
             </w:r>
             <w:r>
               <w:rPr>
@@ -15963,7 +14947,6 @@
               </w:rPr>
               <w:t xml:space="preserve"> geändert zu </w:t>
             </w:r>
-            <w:proofErr w:type="spellStart"/>
             <w:r>
               <w:rPr>
                 <w:rFonts w:ascii="Times New Roman" w:hAnsi="Times New Roman" w:cs="Times New Roman"/>
@@ -15975,7 +14958,6 @@
               </w:rPr>
               <w:t>pizz</w:t>
             </w:r>
-            <w:proofErr w:type="spellEnd"/>
             <w:r>
               <w:rPr>
                 <w:rFonts w:ascii="Times New Roman" w:hAnsi="Times New Roman" w:cs="Times New Roman"/>
@@ -16168,27 +15150,15 @@
                 <w:lang w:val="de-DE"/>
               </w:rPr>
             </w:pPr>
-            <w:proofErr w:type="spellStart"/>
-            <w:r>
-              <w:rPr>
-                <w:rFonts w:ascii="Times New Roman" w:hAnsi="Times New Roman" w:cs="Times New Roman"/>
-                <w:sz w:val="20"/>
-                <w:szCs w:val="20"/>
-                <w:lang w:val="de-DE"/>
-              </w:rPr>
-              <w:t>Legatobögen</w:t>
-            </w:r>
-            <w:proofErr w:type="spellEnd"/>
-            <w:r>
-              <w:rPr>
-                <w:rFonts w:ascii="Times New Roman" w:hAnsi="Times New Roman" w:cs="Times New Roman"/>
-                <w:sz w:val="20"/>
-                <w:szCs w:val="20"/>
-                <w:lang w:val="de-DE"/>
-              </w:rPr>
-              <w:t xml:space="preserve"> alle zwei Noten gestrichen mit rotem Buntstift. Siehe auch Korrektur zu </w:t>
-            </w:r>
-            <w:proofErr w:type="spellStart"/>
+            <w:r>
+              <w:rPr>
+                <w:rFonts w:ascii="Times New Roman" w:hAnsi="Times New Roman" w:cs="Times New Roman"/>
+                <w:sz w:val="20"/>
+                <w:szCs w:val="20"/>
+                <w:lang w:val="de-DE"/>
+              </w:rPr>
+              <w:t xml:space="preserve">Legatobögen alle zwei Noten gestrichen mit rotem Buntstift. Siehe auch Korrektur zu </w:t>
+            </w:r>
             <w:r>
               <w:rPr>
                 <w:rFonts w:ascii="Times New Roman" w:hAnsi="Times New Roman" w:cs="Times New Roman"/>
@@ -16200,7 +15170,6 @@
               </w:rPr>
               <w:t>pizz</w:t>
             </w:r>
-            <w:proofErr w:type="spellEnd"/>
             <w:r>
               <w:rPr>
                 <w:rFonts w:ascii="Times New Roman" w:hAnsi="Times New Roman" w:cs="Times New Roman"/>
@@ -16376,7 +15345,6 @@
               </w:rPr>
               <w:t xml:space="preserve">Zuerst: </w:t>
             </w:r>
-            <w:proofErr w:type="spellStart"/>
             <w:r>
               <w:rPr>
                 <w:rFonts w:ascii="Times New Roman" w:hAnsi="Times New Roman" w:cs="Times New Roman"/>
@@ -16388,7 +15356,6 @@
               </w:rPr>
               <w:t>rit</w:t>
             </w:r>
-            <w:proofErr w:type="spellEnd"/>
             <w:r>
               <w:rPr>
                 <w:rFonts w:ascii="Times New Roman" w:hAnsi="Times New Roman" w:cs="Times New Roman"/>
@@ -16454,7 +15421,6 @@
               </w:rPr>
               <w:t xml:space="preserve"> </w:t>
             </w:r>
-            <w:proofErr w:type="spellStart"/>
             <w:r>
               <w:rPr>
                 <w:rFonts w:ascii="Times New Roman" w:hAnsi="Times New Roman" w:cs="Times New Roman"/>
@@ -16465,7 +15431,6 @@
               </w:rPr>
               <w:t>rit</w:t>
             </w:r>
-            <w:proofErr w:type="spellEnd"/>
             <w:r>
               <w:rPr>
                 <w:rFonts w:ascii="Times New Roman" w:hAnsi="Times New Roman" w:cs="Times New Roman"/>
@@ -16597,7 +15562,6 @@
                 <w:lang w:val="de-DE"/>
               </w:rPr>
             </w:pPr>
-            <w:proofErr w:type="spellStart"/>
             <w:r>
               <w:rPr>
                 <w:rFonts w:ascii="Times New Roman" w:hAnsi="Times New Roman" w:cs="Times New Roman"/>
@@ -16608,7 +15572,6 @@
               </w:rPr>
               <w:t>etc</w:t>
             </w:r>
-            <w:proofErr w:type="spellEnd"/>
             <w:r>
               <w:rPr>
                 <w:rFonts w:ascii="Times New Roman" w:hAnsi="Times New Roman" w:cs="Times New Roman"/>
@@ -16875,7 +15838,6 @@
                 <w:lang w:val="de-DE"/>
               </w:rPr>
             </w:pPr>
-            <w:proofErr w:type="spellStart"/>
             <w:r>
               <w:rPr>
                 <w:rFonts w:ascii="Times New Roman" w:hAnsi="Times New Roman" w:cs="Times New Roman"/>
@@ -16886,7 +15848,6 @@
               </w:rPr>
               <w:t>rit</w:t>
             </w:r>
-            <w:proofErr w:type="spellEnd"/>
             <w:r>
               <w:rPr>
                 <w:rFonts w:ascii="Times New Roman" w:hAnsi="Times New Roman" w:cs="Times New Roman"/>
@@ -17027,27 +15988,7 @@
                 <w:szCs w:val="20"/>
                 <w:lang w:val="de-DE"/>
               </w:rPr>
-              <w:t>[</w:t>
-            </w:r>
-            <w:proofErr w:type="gramStart"/>
-            <w:r>
-              <w:rPr>
-                <w:rFonts w:ascii="Times New Roman" w:hAnsi="Times New Roman" w:cs="Times New Roman"/>
-                <w:sz w:val="20"/>
-                <w:szCs w:val="20"/>
-                <w:lang w:val="de-DE"/>
-              </w:rPr>
-              <w:t>#]fis</w:t>
-            </w:r>
-            <w:proofErr w:type="gramEnd"/>
-            <w:r>
-              <w:rPr>
-                <w:rFonts w:ascii="Times New Roman" w:hAnsi="Times New Roman" w:cs="Times New Roman"/>
-                <w:sz w:val="20"/>
-                <w:szCs w:val="20"/>
-                <w:lang w:val="de-DE"/>
-              </w:rPr>
-              <w:t>/[a]h in Klav. u., h in Klav. o. gestrichen und [a] zu d</w:t>
+              <w:t>[#]fis/[a]h in Klav. u., h in Klav. o. gestrichen und [a] zu d</w:t>
             </w:r>
             <w:r>
               <w:rPr>
@@ -17691,27 +16632,7 @@
                 <w:szCs w:val="20"/>
                 <w:lang w:val="de-DE"/>
               </w:rPr>
-              <w:t xml:space="preserve">Zuerst: </w:t>
-            </w:r>
-            <w:proofErr w:type="spellStart"/>
-            <w:r>
-              <w:rPr>
-                <w:rFonts w:ascii="Times New Roman" w:hAnsi="Times New Roman" w:cs="Times New Roman"/>
-                <w:sz w:val="20"/>
-                <w:szCs w:val="20"/>
-                <w:lang w:val="de-DE"/>
-              </w:rPr>
-              <w:t>Tonnamen</w:t>
-            </w:r>
-            <w:proofErr w:type="spellEnd"/>
-            <w:r>
-              <w:rPr>
-                <w:rFonts w:ascii="Times New Roman" w:hAnsi="Times New Roman" w:cs="Times New Roman"/>
-                <w:sz w:val="20"/>
-                <w:szCs w:val="20"/>
-                <w:lang w:val="de-DE"/>
-              </w:rPr>
-              <w:t xml:space="preserve"> </w:t>
+              <w:t xml:space="preserve">Zuerst: Tonnamen </w:t>
             </w:r>
             <w:r>
               <w:rPr>
@@ -17722,21 +16643,8 @@
                 <w:szCs w:val="20"/>
                 <w:lang w:val="de-DE"/>
               </w:rPr>
-              <w:t xml:space="preserve">b | d | </w:t>
-            </w:r>
-            <w:proofErr w:type="spellStart"/>
-            <w:r>
-              <w:rPr>
-                <w:rFonts w:ascii="Times New Roman" w:hAnsi="Times New Roman" w:cs="Times New Roman"/>
-                <w:i/>
-                <w:iCs/>
-                <w:sz w:val="20"/>
-                <w:szCs w:val="20"/>
-                <w:lang w:val="de-DE"/>
-              </w:rPr>
-              <w:t>fis</w:t>
-            </w:r>
-            <w:proofErr w:type="spellEnd"/>
+              <w:t>b | d | fis</w:t>
+            </w:r>
             <w:r>
               <w:rPr>
                 <w:rFonts w:ascii="Times New Roman" w:hAnsi="Times New Roman" w:cs="Times New Roman"/>
@@ -17765,27 +16673,7 @@
                 <w:szCs w:val="20"/>
                 <w:lang w:val="de-DE"/>
               </w:rPr>
-              <w:t xml:space="preserve">Dann: Halbe Note </w:t>
-            </w:r>
-            <w:proofErr w:type="spellStart"/>
-            <w:r>
-              <w:rPr>
-                <w:rFonts w:ascii="Times New Roman" w:hAnsi="Times New Roman" w:cs="Times New Roman"/>
-                <w:sz w:val="20"/>
-                <w:szCs w:val="20"/>
-                <w:lang w:val="de-DE"/>
-              </w:rPr>
-              <w:t>fis</w:t>
-            </w:r>
-            <w:proofErr w:type="spellEnd"/>
-            <w:r>
-              <w:rPr>
-                <w:rFonts w:ascii="Times New Roman" w:hAnsi="Times New Roman" w:cs="Times New Roman"/>
-                <w:sz w:val="20"/>
-                <w:szCs w:val="20"/>
-                <w:lang w:val="de-DE"/>
-              </w:rPr>
-              <w:t>/d</w:t>
+              <w:t>Dann: Halbe Note fis/d</w:t>
             </w:r>
             <w:r>
               <w:rPr>
@@ -17823,27 +16711,7 @@
                 <w:szCs w:val="20"/>
                 <w:lang w:val="de-DE"/>
               </w:rPr>
-              <w:t xml:space="preserve"> und </w:t>
-            </w:r>
-            <w:proofErr w:type="spellStart"/>
-            <w:r>
-              <w:rPr>
-                <w:rFonts w:ascii="Times New Roman" w:hAnsi="Times New Roman" w:cs="Times New Roman"/>
-                <w:sz w:val="20"/>
-                <w:szCs w:val="20"/>
-                <w:lang w:val="de-DE"/>
-              </w:rPr>
-              <w:t>Arpeggioschlange</w:t>
-            </w:r>
-            <w:proofErr w:type="spellEnd"/>
-            <w:r>
-              <w:rPr>
-                <w:rFonts w:ascii="Times New Roman" w:hAnsi="Times New Roman" w:cs="Times New Roman"/>
-                <w:sz w:val="20"/>
-                <w:szCs w:val="20"/>
-                <w:lang w:val="de-DE"/>
-              </w:rPr>
-              <w:t xml:space="preserve"> (wie Textfassung 3) hinzugefügt mit rotem Buntstift.</w:t>
+              <w:t xml:space="preserve"> und Arpeggioschlange (wie Textfassung 3) hinzugefügt mit rotem Buntstift.</w:t>
             </w:r>
           </w:p>
         </w:tc>
@@ -18226,7 +17094,6 @@
                 <w:lang w:val="de-DE"/>
               </w:rPr>
             </w:pPr>
-            <w:proofErr w:type="spellStart"/>
             <w:r>
               <w:rPr>
                 <w:rFonts w:ascii="Times New Roman" w:hAnsi="Times New Roman" w:cs="Times New Roman"/>
@@ -18237,7 +17104,6 @@
               </w:rPr>
               <w:t>rit</w:t>
             </w:r>
-            <w:proofErr w:type="spellEnd"/>
             <w:r>
               <w:rPr>
                 <w:rFonts w:ascii="Times New Roman" w:hAnsi="Times New Roman" w:cs="Times New Roman"/>
@@ -18850,7 +17716,6 @@
                 <w:lang w:val="de-DE"/>
               </w:rPr>
             </w:pPr>
-            <w:proofErr w:type="spellStart"/>
             <w:r>
               <w:rPr>
                 <w:rFonts w:ascii="Times New Roman" w:hAnsi="Times New Roman" w:cs="Times New Roman"/>
@@ -18862,7 +17727,6 @@
               </w:rPr>
               <w:t>rit</w:t>
             </w:r>
-            <w:proofErr w:type="spellEnd"/>
             <w:r>
               <w:rPr>
                 <w:rFonts w:ascii="Times New Roman" w:hAnsi="Times New Roman" w:cs="Times New Roman"/>
@@ -19651,27 +18515,7 @@
                 <w:szCs w:val="20"/>
                 <w:lang w:val="de-DE"/>
               </w:rPr>
-              <w:t>[pp] geändert zu [</w:t>
-            </w:r>
-            <w:proofErr w:type="spellStart"/>
-            <w:r>
-              <w:rPr>
-                <w:rFonts w:ascii="Times New Roman" w:hAnsi="Times New Roman" w:cs="Times New Roman"/>
-                <w:sz w:val="20"/>
-                <w:szCs w:val="20"/>
-                <w:lang w:val="de-DE"/>
-              </w:rPr>
-              <w:t>ppp</w:t>
-            </w:r>
-            <w:proofErr w:type="spellEnd"/>
-            <w:r>
-              <w:rPr>
-                <w:rFonts w:ascii="Times New Roman" w:hAnsi="Times New Roman" w:cs="Times New Roman"/>
-                <w:sz w:val="20"/>
-                <w:szCs w:val="20"/>
-                <w:lang w:val="de-DE"/>
-              </w:rPr>
-              <w:t>] (wie Textfassung 3) mit rotem Buntstift.</w:t>
+              <w:t>[pp] geändert zu [ppp] (wie Textfassung 3) mit rotem Buntstift.</w:t>
             </w:r>
           </w:p>
         </w:tc>
@@ -20270,27 +19114,7 @@
                 <w:szCs w:val="20"/>
                 <w:lang w:val="de-DE"/>
               </w:rPr>
-              <w:t xml:space="preserve">Unterstimmenschicht: </w:t>
-            </w:r>
-            <w:proofErr w:type="spellStart"/>
-            <w:r>
-              <w:rPr>
-                <w:rFonts w:ascii="Times New Roman" w:hAnsi="Times New Roman" w:cs="Times New Roman"/>
-                <w:sz w:val="20"/>
-                <w:szCs w:val="20"/>
-                <w:lang w:val="de-DE"/>
-              </w:rPr>
-              <w:t>Tonnamen</w:t>
-            </w:r>
-            <w:proofErr w:type="spellEnd"/>
-            <w:r>
-              <w:rPr>
-                <w:rFonts w:ascii="Times New Roman" w:hAnsi="Times New Roman" w:cs="Times New Roman"/>
-                <w:sz w:val="20"/>
-                <w:szCs w:val="20"/>
-                <w:lang w:val="de-DE"/>
-              </w:rPr>
-              <w:t xml:space="preserve"> </w:t>
+              <w:t xml:space="preserve">Unterstimmenschicht: Tonnamen </w:t>
             </w:r>
             <w:r>
               <w:rPr>
@@ -20974,7 +19798,6 @@
               </w:rPr>
               <w:t xml:space="preserve"> und </w:t>
             </w:r>
-            <w:proofErr w:type="spellStart"/>
             <w:r>
               <w:rPr>
                 <w:rFonts w:ascii="Times New Roman" w:hAnsi="Times New Roman" w:cs="Times New Roman"/>
@@ -20986,7 +19809,6 @@
               </w:rPr>
               <w:t>dis</w:t>
             </w:r>
-            <w:proofErr w:type="spellEnd"/>
             <w:r>
               <w:rPr>
                 <w:rFonts w:ascii="Times New Roman" w:hAnsi="Times New Roman" w:cs="Times New Roman"/>
@@ -21034,27 +19856,7 @@
                 <w:szCs w:val="20"/>
                 <w:lang w:val="de-DE"/>
               </w:rPr>
-              <w:t xml:space="preserve"> (wie Textfassung 3) auf handgezogenen Notenlinien am linken </w:t>
-            </w:r>
-            <w:proofErr w:type="spellStart"/>
-            <w:r>
-              <w:rPr>
-                <w:rFonts w:ascii="Times New Roman" w:hAnsi="Times New Roman" w:cs="Times New Roman"/>
-                <w:sz w:val="20"/>
-                <w:szCs w:val="20"/>
-                <w:lang w:val="de-DE"/>
-              </w:rPr>
-              <w:t>Akkoladenrand</w:t>
-            </w:r>
-            <w:proofErr w:type="spellEnd"/>
-            <w:r>
-              <w:rPr>
-                <w:rFonts w:ascii="Times New Roman" w:hAnsi="Times New Roman" w:cs="Times New Roman"/>
-                <w:sz w:val="20"/>
-                <w:szCs w:val="20"/>
-                <w:lang w:val="de-DE"/>
-              </w:rPr>
-              <w:t xml:space="preserve"> hinzugefügt mit Bleistift.</w:t>
+              <w:t xml:space="preserve"> (wie Textfassung 3) auf handgezogenen Notenlinien am linken Akkoladenrand hinzugefügt mit Bleistift.</w:t>
             </w:r>
           </w:p>
         </w:tc>
@@ -21949,7 +20751,6 @@
               </w:rPr>
               <w:t xml:space="preserve">Tonbuchstabe </w:t>
             </w:r>
-            <w:proofErr w:type="spellStart"/>
             <w:r>
               <w:rPr>
                 <w:rFonts w:ascii="Times New Roman" w:hAnsi="Times New Roman" w:cs="Times New Roman"/>
@@ -21961,7 +20762,6 @@
               </w:rPr>
               <w:t>as</w:t>
             </w:r>
-            <w:proofErr w:type="spellEnd"/>
             <w:r>
               <w:rPr>
                 <w:rFonts w:ascii="Times New Roman" w:hAnsi="Times New Roman" w:cs="Times New Roman"/>
@@ -22086,7 +20886,6 @@
                 <w:lang w:val="de-DE"/>
               </w:rPr>
             </w:pPr>
-            <w:proofErr w:type="spellStart"/>
             <w:r>
               <w:rPr>
                 <w:rFonts w:ascii="Times New Roman" w:hAnsi="Times New Roman" w:cs="Times New Roman"/>
@@ -22098,7 +20897,6 @@
               </w:rPr>
               <w:t>rit</w:t>
             </w:r>
-            <w:proofErr w:type="spellEnd"/>
             <w:r>
               <w:rPr>
                 <w:rFonts w:ascii="Times New Roman" w:hAnsi="Times New Roman" w:cs="Times New Roman"/>
@@ -22239,27 +21037,7 @@
                 <w:szCs w:val="20"/>
                 <w:lang w:val="de-DE"/>
               </w:rPr>
-              <w:t>[</w:t>
-            </w:r>
-            <w:proofErr w:type="spellStart"/>
-            <w:r>
-              <w:rPr>
-                <w:rFonts w:ascii="Times New Roman" w:hAnsi="Times New Roman" w:cs="Times New Roman"/>
-                <w:sz w:val="20"/>
-                <w:szCs w:val="20"/>
-                <w:lang w:val="de-DE"/>
-              </w:rPr>
-              <w:t>ppp</w:t>
-            </w:r>
-            <w:proofErr w:type="spellEnd"/>
-            <w:r>
-              <w:rPr>
-                <w:rFonts w:ascii="Times New Roman" w:hAnsi="Times New Roman" w:cs="Times New Roman"/>
-                <w:sz w:val="20"/>
-                <w:szCs w:val="20"/>
-                <w:lang w:val="de-DE"/>
-              </w:rPr>
-              <w:t>] (wie Textfassung 3) hinzugefügt mit rotem Buntstift.</w:t>
+              <w:t>[ppp] (wie Textfassung 3) hinzugefügt mit rotem Buntstift.</w:t>
             </w:r>
           </w:p>
         </w:tc>
@@ -22418,7 +21196,6 @@
                 <w:lang w:val="de-DE"/>
               </w:rPr>
             </w:pPr>
-            <w:proofErr w:type="spellStart"/>
             <w:r>
               <w:rPr>
                 <w:rFonts w:ascii="Times New Roman" w:hAnsi="Times New Roman" w:cs="Times New Roman"/>
@@ -22430,7 +21207,6 @@
               </w:rPr>
               <w:t>accell</w:t>
             </w:r>
-            <w:proofErr w:type="spellEnd"/>
             <w:r>
               <w:rPr>
                 <w:rFonts w:ascii="Times New Roman" w:hAnsi="Times New Roman" w:cs="Times New Roman"/>
@@ -23588,27 +22364,7 @@
                 <w:szCs w:val="20"/>
                 <w:lang w:val="de-DE"/>
               </w:rPr>
-              <w:t xml:space="preserve">Ein Legatobogen geändert zu zwei </w:t>
-            </w:r>
-            <w:proofErr w:type="spellStart"/>
-            <w:r>
-              <w:rPr>
-                <w:rFonts w:ascii="Times New Roman" w:hAnsi="Times New Roman" w:cs="Times New Roman"/>
-                <w:sz w:val="20"/>
-                <w:szCs w:val="20"/>
-                <w:lang w:val="de-DE"/>
-              </w:rPr>
-              <w:t>Legatobögen</w:t>
-            </w:r>
-            <w:proofErr w:type="spellEnd"/>
-            <w:r>
-              <w:rPr>
-                <w:rFonts w:ascii="Times New Roman" w:hAnsi="Times New Roman" w:cs="Times New Roman"/>
-                <w:sz w:val="20"/>
-                <w:szCs w:val="20"/>
-                <w:lang w:val="de-DE"/>
-              </w:rPr>
-              <w:t xml:space="preserve"> 5–8/16 und 9–12/16 (wie Textfassung 3) mit rotem Buntstift.</w:t>
+              <w:t>Ein Legatobogen geändert zu zwei Legatobögen 5–8/16 und 9–12/16 (wie Textfassung 3) mit rotem Buntstift.</w:t>
             </w:r>
           </w:p>
         </w:tc>
@@ -24473,7 +23229,6 @@
                 <w:szCs w:val="20"/>
               </w:rPr>
             </w:pPr>
-            <w:proofErr w:type="spellStart"/>
             <w:r>
               <w:rPr>
                 <w:rFonts w:ascii="Times New Roman" w:hAnsi="Times New Roman" w:cs="Times New Roman"/>
@@ -24484,7 +23239,6 @@
               </w:rPr>
               <w:t>accell</w:t>
             </w:r>
-            <w:proofErr w:type="spellEnd"/>
             <w:r>
               <w:rPr>
                 <w:rFonts w:ascii="Times New Roman" w:hAnsi="Times New Roman" w:cs="Times New Roman"/>
@@ -25146,7 +23900,6 @@
                 <w:szCs w:val="20"/>
               </w:rPr>
             </w:pPr>
-            <w:proofErr w:type="spellStart"/>
             <w:r>
               <w:rPr>
                 <w:rFonts w:ascii="Times New Roman" w:hAnsi="Times New Roman" w:cs="Times New Roman"/>
@@ -25157,7 +23910,6 @@
               </w:rPr>
               <w:t>rit</w:t>
             </w:r>
-            <w:proofErr w:type="spellEnd"/>
             <w:r>
               <w:rPr>
                 <w:rFonts w:ascii="Times New Roman" w:hAnsi="Times New Roman" w:cs="Times New Roman"/>
@@ -25174,20 +23926,8 @@
                 <w:sz w:val="20"/>
                 <w:szCs w:val="20"/>
               </w:rPr>
-              <w:t xml:space="preserve">molto </w:t>
-            </w:r>
-            <w:proofErr w:type="spellStart"/>
-            <w:r>
-              <w:rPr>
-                <w:rFonts w:ascii="Times New Roman" w:hAnsi="Times New Roman" w:cs="Times New Roman"/>
-                <w:i/>
-                <w:iCs/>
-                <w:sz w:val="20"/>
-                <w:szCs w:val="20"/>
-              </w:rPr>
-              <w:t>rit</w:t>
-            </w:r>
-            <w:proofErr w:type="spellEnd"/>
+              <w:t>molto rit</w:t>
+            </w:r>
             <w:r>
               <w:rPr>
                 <w:rFonts w:ascii="Times New Roman" w:hAnsi="Times New Roman" w:cs="Times New Roman"/>
@@ -25503,25 +24243,7 @@
                 <w:sz w:val="20"/>
                 <w:szCs w:val="20"/>
               </w:rPr>
-              <w:t>[</w:t>
-            </w:r>
-            <w:proofErr w:type="spellStart"/>
-            <w:r>
-              <w:rPr>
-                <w:rFonts w:ascii="Times New Roman" w:hAnsi="Times New Roman" w:cs="Times New Roman"/>
-                <w:sz w:val="20"/>
-                <w:szCs w:val="20"/>
-              </w:rPr>
-              <w:t>sfff</w:t>
-            </w:r>
-            <w:proofErr w:type="spellEnd"/>
-            <w:r>
-              <w:rPr>
-                <w:rFonts w:ascii="Times New Roman" w:hAnsi="Times New Roman" w:cs="Times New Roman"/>
-                <w:sz w:val="20"/>
-                <w:szCs w:val="20"/>
-              </w:rPr>
-              <w:t xml:space="preserve">] (wie Textfassung 3) </w:t>
+              <w:t xml:space="preserve">[sfff] (wie Textfassung 3) </w:t>
             </w:r>
             <w:r>
               <w:rPr>
@@ -25962,25 +24684,7 @@
                 <w:sz w:val="20"/>
                 <w:szCs w:val="20"/>
               </w:rPr>
-              <w:t xml:space="preserve">Legatobogen geändert zu </w:t>
-            </w:r>
-            <w:proofErr w:type="spellStart"/>
-            <w:r>
-              <w:rPr>
-                <w:rFonts w:ascii="Times New Roman" w:hAnsi="Times New Roman" w:cs="Times New Roman"/>
-                <w:sz w:val="20"/>
-                <w:szCs w:val="20"/>
-              </w:rPr>
-              <w:t>Legatobögen</w:t>
-            </w:r>
-            <w:proofErr w:type="spellEnd"/>
-            <w:r>
-              <w:rPr>
-                <w:rFonts w:ascii="Times New Roman" w:hAnsi="Times New Roman" w:cs="Times New Roman"/>
-                <w:sz w:val="20"/>
-                <w:szCs w:val="20"/>
-              </w:rPr>
-              <w:t xml:space="preserve"> T. 22 1. Note bis T. 23 1/4 und T. 23 2.–3. Note</w:t>
+              <w:t>Legatobogen geändert zu Legatobögen T. 22 1. Note bis T. 23 1/4 und T. 23 2.–3. Note</w:t>
             </w:r>
             <w:r>
               <w:rPr>
@@ -27044,25 +25748,7 @@
                 <w:sz w:val="20"/>
                 <w:szCs w:val="20"/>
               </w:rPr>
-              <w:t xml:space="preserve"> [</w:t>
-            </w:r>
-            <w:proofErr w:type="spellStart"/>
-            <w:r>
-              <w:rPr>
-                <w:rFonts w:ascii="Times New Roman" w:hAnsi="Times New Roman" w:cs="Times New Roman"/>
-                <w:sz w:val="20"/>
-                <w:szCs w:val="20"/>
-              </w:rPr>
-              <w:t>sfff</w:t>
-            </w:r>
-            <w:proofErr w:type="spellEnd"/>
-            <w:r>
-              <w:rPr>
-                <w:rFonts w:ascii="Times New Roman" w:hAnsi="Times New Roman" w:cs="Times New Roman"/>
-                <w:sz w:val="20"/>
-                <w:szCs w:val="20"/>
-              </w:rPr>
-              <w:t xml:space="preserve">] gestrichen (wie Textfassung 3) </w:t>
+              <w:t xml:space="preserve"> [sfff] gestrichen (wie Textfassung 3) </w:t>
             </w:r>
             <w:r>
               <w:rPr>

</xml_diff>